<commit_message>
feat: add beginner-friendly platform guide
</commit_message>
<xml_diff>
--- a/提交材料/03_调控师操作手册.docx
+++ b/提交材料/03_调控师操作手册.docx
@@ -4,30 +4,31 @@
   <w:body>
     <w:p>
       <w:pPr>
+        <w:spacing w:after="80"/>
         <w:jc w:val="center"/>
       </w:pPr>
       <w:r>
         <w:rPr>
           <w:rFonts w:ascii="Calibri" w:hAnsi="Calibri" w:eastAsia="Microsoft YaHei"/>
           <w:b/>
-          <w:color w:val="0D1F30"/>
-          <w:sz w:val="42"/>
+          <w:color w:val="000000"/>
+          <w:sz w:val="44"/>
         </w:rPr>
         <w:t>调控师操作手册</w:t>
       </w:r>
     </w:p>
     <w:p>
       <w:pPr>
-        <w:spacing w:after="300"/>
+        <w:spacing w:after="320"/>
         <w:jc w:val="center"/>
       </w:pPr>
       <w:r>
         <w:rPr>
           <w:rFonts w:ascii="Calibri" w:hAnsi="Calibri" w:eastAsia="Microsoft YaHei"/>
-          <w:color w:val="5A6976"/>
-          <w:sz w:val="21"/>
+          <w:color w:val="505050"/>
+          <w:sz w:val="22"/>
         </w:rPr>
-        <w:t>班次调度建议、飞书协同与转人工处理</w:t>
+        <w:t>合成氨智能调控师工作台：班组使用与异常处置</w:t>
       </w:r>
     </w:p>
     <w:p>
@@ -35,7 +36,23 @@
         <w:pStyle w:val="Heading1"/>
       </w:pPr>
       <w:r>
-        <w:t>1. 当班操作流程</w:t>
+        <w:t>1. 调控师角色</w:t>
+      </w:r>
+    </w:p>
+    <w:p>
+      <w:r>
+        <w:rPr>
+          <w:rFonts w:ascii="Calibri" w:hAnsi="Calibri" w:eastAsia="Microsoft YaHei"/>
+        </w:rPr>
+        <w:t>调控师不是替代班长的自动控制系统，而是帮助当班人员在订单、库存、能耗、设备和安全边界之间快速形成可解释方案的副驾驶。所有高风险动作必须保留人工确认。</w:t>
+      </w:r>
+    </w:p>
+    <w:p>
+      <w:pPr>
+        <w:pStyle w:val="Heading1"/>
+      </w:pPr>
+      <w:r>
+        <w:t>2. 当班流程</w:t>
       </w:r>
     </w:p>
     <w:tbl>
@@ -47,22 +64,23 @@
         <w:tblLook w:firstColumn="1" w:firstRow="1" w:lastColumn="0" w:lastRow="0" w:noHBand="0" w:noVBand="1" w:val="04A0"/>
       </w:tblPr>
       <w:tblGrid>
-        <w:gridCol w:w="2441"/>
-        <w:gridCol w:w="2441"/>
-        <w:gridCol w:w="2441"/>
-        <w:gridCol w:w="2441"/>
+        <w:gridCol w:w="2412"/>
+        <w:gridCol w:w="2412"/>
+        <w:gridCol w:w="2412"/>
+        <w:gridCol w:w="2412"/>
       </w:tblGrid>
       <w:tr>
         <w:tc>
           <w:tcPr>
-            <w:tcW w:type="dxa" w:w="1440"/>
-            <w:shd w:fill="EAF2F8"/>
+            <w:tcW w:type="dxa" w:w="1728"/>
+            <w:vAlign w:val="center"/>
             <w:tcMar>
-              <w:top w:w="90" w:type="dxa"/>
+              <w:top w:w="80" w:type="dxa"/>
               <w:start w:w="120" w:type="dxa"/>
-              <w:bottom w:w="90" w:type="dxa"/>
+              <w:bottom w:w="80" w:type="dxa"/>
               <w:end w:w="120" w:type="dxa"/>
             </w:tcMar>
+            <w:shd w:fill="E8EEF5"/>
           </w:tcPr>
           <w:p>
             <w:r>
@@ -70,20 +88,21 @@
                 <w:rFonts w:ascii="Calibri" w:hAnsi="Calibri" w:eastAsia="Microsoft YaHei"/>
                 <w:b/>
               </w:rPr>
-              <w:t>时间点</w:t>
+              <w:t>环节</w:t>
             </w:r>
           </w:p>
         </w:tc>
         <w:tc>
           <w:tcPr>
-            <w:tcW w:type="dxa" w:w="3168"/>
-            <w:shd w:fill="EAF2F8"/>
+            <w:tcW w:type="dxa" w:w="3024"/>
+            <w:vAlign w:val="center"/>
             <w:tcMar>
-              <w:top w:w="90" w:type="dxa"/>
+              <w:top w:w="80" w:type="dxa"/>
               <w:start w:w="120" w:type="dxa"/>
-              <w:bottom w:w="90" w:type="dxa"/>
+              <w:bottom w:w="80" w:type="dxa"/>
               <w:end w:w="120" w:type="dxa"/>
             </w:tcMar>
+            <w:shd w:fill="E8EEF5"/>
           </w:tcPr>
           <w:p>
             <w:r>
@@ -91,72 +110,7 @@
                 <w:rFonts w:ascii="Calibri" w:hAnsi="Calibri" w:eastAsia="Microsoft YaHei"/>
                 <w:b/>
               </w:rPr>
-              <w:t>调控师动作</w:t>
-            </w:r>
-          </w:p>
-        </w:tc>
-        <w:tc>
-          <w:tcPr>
-            <w:tcW w:type="dxa" w:w="2880"/>
-            <w:shd w:fill="EAF2F8"/>
-            <w:tcMar>
-              <w:top w:w="90" w:type="dxa"/>
-              <w:start w:w="120" w:type="dxa"/>
-              <w:bottom w:w="90" w:type="dxa"/>
-              <w:end w:w="120" w:type="dxa"/>
-            </w:tcMar>
-          </w:tcPr>
-          <w:p>
-            <w:r>
-              <w:rPr>
-                <w:rFonts w:ascii="Calibri" w:hAnsi="Calibri" w:eastAsia="Microsoft YaHei"/>
-                <w:b/>
-              </w:rPr>
-              <w:t>现场确认</w:t>
-            </w:r>
-          </w:p>
-        </w:tc>
-        <w:tc>
-          <w:tcPr>
-            <w:tcW w:type="dxa" w:w="1872"/>
-            <w:shd w:fill="EAF2F8"/>
-            <w:tcMar>
-              <w:top w:w="90" w:type="dxa"/>
-              <w:start w:w="120" w:type="dxa"/>
-              <w:bottom w:w="90" w:type="dxa"/>
-              <w:end w:w="120" w:type="dxa"/>
-            </w:tcMar>
-          </w:tcPr>
-          <w:p>
-            <w:r>
-              <w:rPr>
-                <w:rFonts w:ascii="Calibri" w:hAnsi="Calibri" w:eastAsia="Microsoft YaHei"/>
-                <w:b/>
-              </w:rPr>
-              <w:t>留痕位置</w:t>
-            </w:r>
-          </w:p>
-        </w:tc>
-      </w:tr>
-      <w:tr>
-        <w:tc>
-          <w:tcPr>
-            <w:tcW w:type="dxa" w:w="1440"/>
-            <w:vAlign w:val="center"/>
-            <w:tcMar>
-              <w:top w:w="90" w:type="dxa"/>
-              <w:start w:w="120" w:type="dxa"/>
-              <w:bottom w:w="90" w:type="dxa"/>
-              <w:end w:w="120" w:type="dxa"/>
-            </w:tcMar>
-          </w:tcPr>
-          <w:p>
-            <w:r>
-              <w:rPr>
-                <w:rFonts w:ascii="Calibri" w:hAnsi="Calibri" w:eastAsia="Microsoft YaHei"/>
-                <w:sz w:val="18"/>
-              </w:rPr>
-              <w:t>班前30分钟</w:t>
+              <w:t>操作</w:t>
             </w:r>
           </w:p>
         </w:tc>
@@ -165,9 +119,55 @@
             <w:tcW w:type="dxa" w:w="3168"/>
             <w:vAlign w:val="center"/>
             <w:tcMar>
-              <w:top w:w="90" w:type="dxa"/>
+              <w:top w:w="80" w:type="dxa"/>
               <w:start w:w="120" w:type="dxa"/>
-              <w:bottom w:w="90" w:type="dxa"/>
+              <w:bottom w:w="80" w:type="dxa"/>
+              <w:end w:w="120" w:type="dxa"/>
+            </w:tcMar>
+            <w:shd w:fill="E8EEF5"/>
+          </w:tcPr>
+          <w:p>
+            <w:r>
+              <w:rPr>
+                <w:rFonts w:ascii="Calibri" w:hAnsi="Calibri" w:eastAsia="Microsoft YaHei"/>
+                <w:b/>
+              </w:rPr>
+              <w:t>输出</w:t>
+            </w:r>
+          </w:p>
+        </w:tc>
+        <w:tc>
+          <w:tcPr>
+            <w:tcW w:type="dxa" w:w="1440"/>
+            <w:vAlign w:val="center"/>
+            <w:tcMar>
+              <w:top w:w="80" w:type="dxa"/>
+              <w:start w:w="120" w:type="dxa"/>
+              <w:bottom w:w="80" w:type="dxa"/>
+              <w:end w:w="120" w:type="dxa"/>
+            </w:tcMar>
+            <w:shd w:fill="E8EEF5"/>
+          </w:tcPr>
+          <w:p>
+            <w:r>
+              <w:rPr>
+                <w:rFonts w:ascii="Calibri" w:hAnsi="Calibri" w:eastAsia="Microsoft YaHei"/>
+                <w:b/>
+              </w:rPr>
+              <w:t>责任人</w:t>
+            </w:r>
+          </w:p>
+        </w:tc>
+      </w:tr>
+      <w:tr>
+        <w:tc>
+          <w:tcPr>
+            <w:tcW w:type="dxa" w:w="1728"/>
+            <w:vAlign w:val="center"/>
+            <w:tcMar>
+              <w:top w:w="80" w:type="dxa"/>
+              <w:start w:w="120" w:type="dxa"/>
+              <w:bottom w:w="80" w:type="dxa"/>
               <w:end w:w="120" w:type="dxa"/>
             </w:tcMar>
           </w:tcPr>
@@ -175,20 +175,20 @@
             <w:r>
               <w:rPr>
                 <w:rFonts w:ascii="Calibri" w:hAnsi="Calibri" w:eastAsia="Microsoft YaHei"/>
-                <w:sz w:val="18"/>
+                <w:sz w:val="19"/>
               </w:rPr>
-              <w:t>刷新订单、液氨库存、下游需求、行情、公用工程和设备状态，生成班次调度事实表。</w:t>
+              <w:t>班前 30 分钟</w:t>
             </w:r>
           </w:p>
         </w:tc>
         <w:tc>
           <w:tcPr>
-            <w:tcW w:type="dxa" w:w="2880"/>
+            <w:tcW w:type="dxa" w:w="3024"/>
             <w:vAlign w:val="center"/>
             <w:tcMar>
-              <w:top w:w="90" w:type="dxa"/>
+              <w:top w:w="80" w:type="dxa"/>
               <w:start w:w="120" w:type="dxa"/>
-              <w:bottom w:w="90" w:type="dxa"/>
+              <w:bottom w:w="80" w:type="dxa"/>
               <w:end w:w="120" w:type="dxa"/>
             </w:tcMar>
           </w:tcPr>
@@ -196,53 +196,9 @@
             <w:r>
               <w:rPr>
                 <w:rFonts w:ascii="Calibri" w:hAnsi="Calibri" w:eastAsia="Microsoft YaHei"/>
-                <w:sz w:val="18"/>
+                <w:sz w:val="19"/>
               </w:rPr>
-              <w:t>调度员核对来源、时间戳、单位和质量状态。</w:t>
-            </w:r>
-          </w:p>
-        </w:tc>
-        <w:tc>
-          <w:tcPr>
-            <w:tcW w:type="dxa" w:w="1872"/>
-            <w:vAlign w:val="center"/>
-            <w:tcMar>
-              <w:top w:w="90" w:type="dxa"/>
-              <w:start w:w="120" w:type="dxa"/>
-              <w:bottom w:w="90" w:type="dxa"/>
-              <w:end w:w="120" w:type="dxa"/>
-            </w:tcMar>
-          </w:tcPr>
-          <w:p>
-            <w:r>
-              <w:rPr>
-                <w:rFonts w:ascii="Calibri" w:hAnsi="Calibri" w:eastAsia="Microsoft YaHei"/>
-                <w:sz w:val="18"/>
-              </w:rPr>
-              <w:t>班次调度事实表</w:t>
-            </w:r>
-          </w:p>
-        </w:tc>
-      </w:tr>
-      <w:tr>
-        <w:tc>
-          <w:tcPr>
-            <w:tcW w:type="dxa" w:w="1440"/>
-            <w:vAlign w:val="center"/>
-            <w:tcMar>
-              <w:top w:w="90" w:type="dxa"/>
-              <w:start w:w="120" w:type="dxa"/>
-              <w:bottom w:w="90" w:type="dxa"/>
-              <w:end w:w="120" w:type="dxa"/>
-            </w:tcMar>
-          </w:tcPr>
-          <w:p>
-            <w:r>
-              <w:rPr>
-                <w:rFonts w:ascii="Calibri" w:hAnsi="Calibri" w:eastAsia="Microsoft YaHei"/>
-                <w:sz w:val="18"/>
-              </w:rPr>
-              <w:t>班前会</w:t>
+              <w:t>刷新订单、库存、设备健康、能源窗口</w:t>
             </w:r>
           </w:p>
         </w:tc>
@@ -251,9 +207,9 @@
             <w:tcW w:type="dxa" w:w="3168"/>
             <w:vAlign w:val="center"/>
             <w:tcMar>
-              <w:top w:w="90" w:type="dxa"/>
+              <w:top w:w="80" w:type="dxa"/>
               <w:start w:w="120" w:type="dxa"/>
-              <w:bottom w:w="90" w:type="dxa"/>
+              <w:bottom w:w="80" w:type="dxa"/>
               <w:end w:w="120" w:type="dxa"/>
             </w:tcMar>
           </w:tcPr>
@@ -261,20 +217,20 @@
             <w:r>
               <w:rPr>
                 <w:rFonts w:ascii="Calibri" w:hAnsi="Calibri" w:eastAsia="Microsoft YaHei"/>
-                <w:sz w:val="18"/>
+                <w:sz w:val="19"/>
               </w:rPr>
-              <w:t>查看产供销建议、跨装置协调事项和设备趋势异常提示。</w:t>
+              <w:t>稳态/冲刺/保守三套方案</w:t>
             </w:r>
           </w:p>
         </w:tc>
         <w:tc>
           <w:tcPr>
-            <w:tcW w:type="dxa" w:w="2880"/>
+            <w:tcW w:type="dxa" w:w="1440"/>
             <w:vAlign w:val="center"/>
             <w:tcMar>
-              <w:top w:w="90" w:type="dxa"/>
+              <w:top w:w="80" w:type="dxa"/>
               <w:start w:w="120" w:type="dxa"/>
-              <w:bottom w:w="90" w:type="dxa"/>
+              <w:bottom w:w="80" w:type="dxa"/>
               <w:end w:w="120" w:type="dxa"/>
             </w:tcMar>
           </w:tcPr>
@@ -282,20 +238,22 @@
             <w:r>
               <w:rPr>
                 <w:rFonts w:ascii="Calibri" w:hAnsi="Calibri" w:eastAsia="Microsoft YaHei"/>
-                <w:sz w:val="18"/>
+                <w:sz w:val="19"/>
               </w:rPr>
-              <w:t>班长确认液氨分配、负荷调整、外采安排和撤销条件。</w:t>
+              <w:t>调度员</w:t>
             </w:r>
           </w:p>
         </w:tc>
+      </w:tr>
+      <w:tr>
         <w:tc>
           <w:tcPr>
-            <w:tcW w:type="dxa" w:w="1872"/>
+            <w:tcW w:type="dxa" w:w="1728"/>
             <w:vAlign w:val="center"/>
             <w:tcMar>
-              <w:top w:w="90" w:type="dxa"/>
+              <w:top w:w="80" w:type="dxa"/>
               <w:start w:w="120" w:type="dxa"/>
-              <w:bottom w:w="90" w:type="dxa"/>
+              <w:bottom w:w="80" w:type="dxa"/>
               <w:end w:w="120" w:type="dxa"/>
             </w:tcMar>
           </w:tcPr>
@@ -303,22 +261,20 @@
             <w:r>
               <w:rPr>
                 <w:rFonts w:ascii="Calibri" w:hAnsi="Calibri" w:eastAsia="Microsoft YaHei"/>
-                <w:sz w:val="18"/>
+                <w:sz w:val="19"/>
               </w:rPr>
-              <w:t>飞书卡片</w:t>
+              <w:t>班前会 10 分钟</w:t>
             </w:r>
           </w:p>
         </w:tc>
-      </w:tr>
-      <w:tr>
         <w:tc>
           <w:tcPr>
-            <w:tcW w:type="dxa" w:w="1440"/>
+            <w:tcW w:type="dxa" w:w="3024"/>
             <w:vAlign w:val="center"/>
             <w:tcMar>
-              <w:top w:w="90" w:type="dxa"/>
+              <w:top w:w="80" w:type="dxa"/>
               <w:start w:w="120" w:type="dxa"/>
-              <w:bottom w:w="90" w:type="dxa"/>
+              <w:bottom w:w="80" w:type="dxa"/>
               <w:end w:w="120" w:type="dxa"/>
             </w:tcMar>
           </w:tcPr>
@@ -326,9 +282,9 @@
             <w:r>
               <w:rPr>
                 <w:rFonts w:ascii="Calibri" w:hAnsi="Calibri" w:eastAsia="Microsoft YaHei"/>
-                <w:sz w:val="18"/>
+                <w:sz w:val="19"/>
               </w:rPr>
-              <w:t>班中偏差</w:t>
+              <w:t>查看差异、红线、需确认动作</w:t>
             </w:r>
           </w:p>
         </w:tc>
@@ -337,9 +293,9 @@
             <w:tcW w:type="dxa" w:w="3168"/>
             <w:vAlign w:val="center"/>
             <w:tcMar>
-              <w:top w:w="90" w:type="dxa"/>
+              <w:top w:w="80" w:type="dxa"/>
               <w:start w:w="120" w:type="dxa"/>
-              <w:bottom w:w="90" w:type="dxa"/>
+              <w:bottom w:w="80" w:type="dxa"/>
               <w:end w:w="120" w:type="dxa"/>
             </w:tcMar>
           </w:tcPr>
@@ -347,20 +303,20 @@
             <w:r>
               <w:rPr>
                 <w:rFonts w:ascii="Calibri" w:hAnsi="Calibri" w:eastAsia="Microsoft YaHei"/>
-                <w:sz w:val="18"/>
+                <w:sz w:val="19"/>
               </w:rPr>
-              <w:t>库存、设备、订单或能源条件变化时重新计算候选方案。</w:t>
+              <w:t>交接摘要与确认项</w:t>
             </w:r>
           </w:p>
         </w:tc>
         <w:tc>
           <w:tcPr>
-            <w:tcW w:type="dxa" w:w="2880"/>
+            <w:tcW w:type="dxa" w:w="1440"/>
             <w:vAlign w:val="center"/>
             <w:tcMar>
-              <w:top w:w="90" w:type="dxa"/>
+              <w:top w:w="80" w:type="dxa"/>
               <w:start w:w="120" w:type="dxa"/>
-              <w:bottom w:w="90" w:type="dxa"/>
+              <w:bottom w:w="80" w:type="dxa"/>
               <w:end w:w="120" w:type="dxa"/>
             </w:tcMar>
           </w:tcPr>
@@ -368,20 +324,22 @@
             <w:r>
               <w:rPr>
                 <w:rFonts w:ascii="Calibri" w:hAnsi="Calibri" w:eastAsia="Microsoft YaHei"/>
-                <w:sz w:val="18"/>
+                <w:sz w:val="19"/>
               </w:rPr>
-              <w:t>未经确认继续执行原计划。</w:t>
+              <w:t>班长</w:t>
             </w:r>
           </w:p>
         </w:tc>
+      </w:tr>
+      <w:tr>
         <w:tc>
           <w:tcPr>
-            <w:tcW w:type="dxa" w:w="1872"/>
+            <w:tcW w:type="dxa" w:w="1728"/>
             <w:vAlign w:val="center"/>
             <w:tcMar>
-              <w:top w:w="90" w:type="dxa"/>
+              <w:top w:w="80" w:type="dxa"/>
               <w:start w:w="120" w:type="dxa"/>
-              <w:bottom w:w="90" w:type="dxa"/>
+              <w:bottom w:w="80" w:type="dxa"/>
               <w:end w:w="120" w:type="dxa"/>
             </w:tcMar>
           </w:tcPr>
@@ -389,22 +347,20 @@
             <w:r>
               <w:rPr>
                 <w:rFonts w:ascii="Calibri" w:hAnsi="Calibri" w:eastAsia="Microsoft YaHei"/>
-                <w:sz w:val="18"/>
+                <w:sz w:val="19"/>
               </w:rPr>
-              <w:t>方案变更记录</w:t>
+              <w:t>班中偏差</w:t>
             </w:r>
           </w:p>
         </w:tc>
-      </w:tr>
-      <w:tr>
         <w:tc>
           <w:tcPr>
-            <w:tcW w:type="dxa" w:w="1440"/>
+            <w:tcW w:type="dxa" w:w="3024"/>
             <w:vAlign w:val="center"/>
             <w:tcMar>
-              <w:top w:w="90" w:type="dxa"/>
+              <w:top w:w="80" w:type="dxa"/>
               <w:start w:w="120" w:type="dxa"/>
-              <w:bottom w:w="90" w:type="dxa"/>
+              <w:bottom w:w="80" w:type="dxa"/>
               <w:end w:w="120" w:type="dxa"/>
             </w:tcMar>
           </w:tcPr>
@@ -412,9 +368,9 @@
             <w:r>
               <w:rPr>
                 <w:rFonts w:ascii="Calibri" w:hAnsi="Calibri" w:eastAsia="Microsoft YaHei"/>
-                <w:sz w:val="18"/>
+                <w:sz w:val="19"/>
               </w:rPr>
-              <w:t>班后复盘</w:t>
+              <w:t>库存、设备、订单超阈值时重算</w:t>
             </w:r>
           </w:p>
         </w:tc>
@@ -423,9 +379,9 @@
             <w:tcW w:type="dxa" w:w="3168"/>
             <w:vAlign w:val="center"/>
             <w:tcMar>
-              <w:top w:w="90" w:type="dxa"/>
+              <w:top w:w="80" w:type="dxa"/>
               <w:start w:w="120" w:type="dxa"/>
-              <w:bottom w:w="90" w:type="dxa"/>
+              <w:bottom w:w="80" w:type="dxa"/>
               <w:end w:w="120" w:type="dxa"/>
             </w:tcMar>
           </w:tcPr>
@@ -433,20 +389,20 @@
             <w:r>
               <w:rPr>
                 <w:rFonts w:ascii="Calibri" w:hAnsi="Calibri" w:eastAsia="Microsoft YaHei"/>
-                <w:sz w:val="18"/>
+                <w:sz w:val="19"/>
               </w:rPr>
-              <w:t>记录采纳状态、实际负荷、能耗、库存、偏差和原因。</w:t>
+              <w:t>重算记录，不自动改控制参数</w:t>
             </w:r>
           </w:p>
         </w:tc>
         <w:tc>
           <w:tcPr>
-            <w:tcW w:type="dxa" w:w="2880"/>
+            <w:tcW w:type="dxa" w:w="1440"/>
             <w:vAlign w:val="center"/>
             <w:tcMar>
-              <w:top w:w="90" w:type="dxa"/>
+              <w:top w:w="80" w:type="dxa"/>
               <w:start w:w="120" w:type="dxa"/>
-              <w:bottom w:w="90" w:type="dxa"/>
+              <w:bottom w:w="80" w:type="dxa"/>
               <w:end w:w="120" w:type="dxa"/>
             </w:tcMar>
           </w:tcPr>
@@ -454,20 +410,22 @@
             <w:r>
               <w:rPr>
                 <w:rFonts w:ascii="Calibri" w:hAnsi="Calibri" w:eastAsia="Microsoft YaHei"/>
-                <w:sz w:val="18"/>
+                <w:sz w:val="19"/>
               </w:rPr>
-              <w:t>班长补充现场判断，专业人员审核后入库。</w:t>
+              <w:t>班长/调度</w:t>
             </w:r>
           </w:p>
         </w:tc>
+      </w:tr>
+      <w:tr>
         <w:tc>
           <w:tcPr>
-            <w:tcW w:type="dxa" w:w="1872"/>
+            <w:tcW w:type="dxa" w:w="1728"/>
             <w:vAlign w:val="center"/>
             <w:tcMar>
-              <w:top w:w="90" w:type="dxa"/>
+              <w:top w:w="80" w:type="dxa"/>
               <w:start w:w="120" w:type="dxa"/>
-              <w:bottom w:w="90" w:type="dxa"/>
+              <w:bottom w:w="80" w:type="dxa"/>
               <w:end w:w="120" w:type="dxa"/>
             </w:tcMar>
           </w:tcPr>
@@ -475,9 +433,72 @@
             <w:r>
               <w:rPr>
                 <w:rFonts w:ascii="Calibri" w:hAnsi="Calibri" w:eastAsia="Microsoft YaHei"/>
-                <w:sz w:val="18"/>
+                <w:sz w:val="19"/>
               </w:rPr>
-              <w:t>飞书多维表格</w:t>
+              <w:t>班后 5 分钟</w:t>
+            </w:r>
+          </w:p>
+        </w:tc>
+        <w:tc>
+          <w:tcPr>
+            <w:tcW w:type="dxa" w:w="3024"/>
+            <w:vAlign w:val="center"/>
+            <w:tcMar>
+              <w:top w:w="80" w:type="dxa"/>
+              <w:start w:w="120" w:type="dxa"/>
+              <w:bottom w:w="80" w:type="dxa"/>
+              <w:end w:w="120" w:type="dxa"/>
+            </w:tcMar>
+          </w:tcPr>
+          <w:p>
+            <w:r>
+              <w:rPr>
+                <w:rFonts w:ascii="Calibri" w:hAnsi="Calibri" w:eastAsia="Microsoft YaHei"/>
+                <w:sz w:val="19"/>
+              </w:rPr>
+              <w:t>记录采纳与否、实际负荷、能耗、异常原因</w:t>
+            </w:r>
+          </w:p>
+        </w:tc>
+        <w:tc>
+          <w:tcPr>
+            <w:tcW w:type="dxa" w:w="3168"/>
+            <w:vAlign w:val="center"/>
+            <w:tcMar>
+              <w:top w:w="80" w:type="dxa"/>
+              <w:start w:w="120" w:type="dxa"/>
+              <w:bottom w:w="80" w:type="dxa"/>
+              <w:end w:w="120" w:type="dxa"/>
+            </w:tcMar>
+          </w:tcPr>
+          <w:p>
+            <w:r>
+              <w:rPr>
+                <w:rFonts w:ascii="Calibri" w:hAnsi="Calibri" w:eastAsia="Microsoft YaHei"/>
+                <w:sz w:val="19"/>
+              </w:rPr>
+              <w:t>复盘样本</w:t>
+            </w:r>
+          </w:p>
+        </w:tc>
+        <w:tc>
+          <w:tcPr>
+            <w:tcW w:type="dxa" w:w="1440"/>
+            <w:vAlign w:val="center"/>
+            <w:tcMar>
+              <w:top w:w="80" w:type="dxa"/>
+              <w:start w:w="120" w:type="dxa"/>
+              <w:bottom w:w="80" w:type="dxa"/>
+              <w:end w:w="120" w:type="dxa"/>
+            </w:tcMar>
+          </w:tcPr>
+          <w:p>
+            <w:r>
+              <w:rPr>
+                <w:rFonts w:ascii="Calibri" w:hAnsi="Calibri" w:eastAsia="Microsoft YaHei"/>
+                <w:sz w:val="19"/>
+              </w:rPr>
+              <w:t>班长</w:t>
             </w:r>
           </w:p>
         </w:tc>
@@ -485,122 +506,10 @@
     </w:tbl>
     <w:p>
       <w:pPr>
-        <w:pStyle w:val="Heading2"/>
-      </w:pPr>
-      <w:r>
-        <w:t>1（一）当班使用顺序</w:t>
-      </w:r>
-    </w:p>
-    <w:p>
-      <w:pPr>
-        <w:pStyle w:val="ListNumber"/>
-        <w:numPr>
-          <w:ilvl w:val="0"/>
-          <w:numId w:val="10"/>
-        </w:numPr>
-      </w:pPr>
-      <w:r>
-        <w:rPr>
-          <w:rFonts w:ascii="Calibri" w:hAnsi="Calibri" w:eastAsia="Microsoft YaHei"/>
-        </w:rPr>
-        <w:t>核对产供销数据：确认订单、库存、价格和相对外售分配贡献测算口径。</w:t>
-      </w:r>
-    </w:p>
-    <w:p>
-      <w:pPr>
-        <w:pStyle w:val="ListNumber"/>
-        <w:numPr>
-          <w:ilvl w:val="0"/>
-          <w:numId w:val="10"/>
-        </w:numPr>
-      </w:pPr>
-      <w:r>
-        <w:rPr>
-          <w:rFonts w:ascii="Calibri" w:hAnsi="Calibri" w:eastAsia="Microsoft YaHei"/>
-        </w:rPr>
-        <w:t>检查连续生产约束：确认下游需求、公用工程、设备和库存变化是否需要跨装置协调。</w:t>
-      </w:r>
-    </w:p>
-    <w:p>
-      <w:pPr>
-        <w:pStyle w:val="ListNumber"/>
-        <w:numPr>
-          <w:ilvl w:val="0"/>
-          <w:numId w:val="10"/>
-        </w:numPr>
-      </w:pPr>
-      <w:r>
-        <w:rPr>
-          <w:rFonts w:ascii="Calibri" w:hAnsi="Calibri" w:eastAsia="Microsoft YaHei"/>
-        </w:rPr>
-        <w:t>检查设备趋势：查看偏离变量、持续时间、数据来源、检查项和通知专业，不直接触发开停车。</w:t>
-      </w:r>
-    </w:p>
-    <w:p>
-      <w:pPr>
-        <w:pStyle w:val="ListNumber"/>
-        <w:numPr>
-          <w:ilvl w:val="0"/>
-          <w:numId w:val="10"/>
-        </w:numPr>
-      </w:pPr>
-      <w:r>
-        <w:rPr>
-          <w:rFonts w:ascii="Calibri" w:hAnsi="Calibri" w:eastAsia="Microsoft YaHei"/>
-        </w:rPr>
-        <w:t>完成班后记录：保存采纳、驳回、执行偏差和现场原因，待专业人员审核后进入案例库。</w:t>
-      </w:r>
-    </w:p>
-    <w:p>
-      <w:pPr>
         <w:pStyle w:val="Heading1"/>
       </w:pPr>
       <w:r>
-        <w:t>2. 飞书协同动作</w:t>
-      </w:r>
-    </w:p>
-    <w:p>
-      <w:pPr>
-        <w:pStyle w:val="ListBullet"/>
-      </w:pPr>
-      <w:r>
-        <w:rPr>
-          <w:rFonts w:ascii="Calibri" w:hAnsi="Calibri" w:eastAsia="Microsoft YaHei"/>
-        </w:rPr>
-        <w:t>互动卡片原型：显示目标负荷、处置状态、触发字段、相对外售分配贡献、撤销条件和确认按钮。</w:t>
-      </w:r>
-    </w:p>
-    <w:p>
-      <w:pPr>
-        <w:pStyle w:val="ListBullet"/>
-      </w:pPr>
-      <w:r>
-        <w:rPr>
-          <w:rFonts w:ascii="Calibri" w:hAnsi="Calibri" w:eastAsia="Microsoft YaHei"/>
-        </w:rPr>
-        <w:t>审批原型：设备、公辅、库存等明确条件成立时生成会签草稿，字段包括装置、目标负荷、触发字段、现场影响和撤销条件。</w:t>
-      </w:r>
-    </w:p>
-    <w:p>
-      <w:pPr>
-        <w:pStyle w:val="ListBullet"/>
-      </w:pPr>
-      <w:r>
-        <w:rPr>
-          <w:rFonts w:ascii="Calibri" w:hAnsi="Calibri" w:eastAsia="Microsoft YaHei"/>
-        </w:rPr>
-        <w:t>飞书多维表格：记录班次事实、采纳状态、未采纳原因、执行偏差和复盘结论。</w:t>
-      </w:r>
-    </w:p>
-    <w:p>
-      <w:pPr>
-        <w:pStyle w:val="ListBullet"/>
-      </w:pPr>
-      <w:r>
-        <w:rPr>
-          <w:rFonts w:ascii="Calibri" w:hAnsi="Calibri" w:eastAsia="Microsoft YaHei"/>
-        </w:rPr>
-        <w:t>飞书智能问答待授权：接入知识源后，可追问降负荷依据、库存可支撑时间和设备趋势检查步骤。</w:t>
+        <w:t>3. 典型调控场景</w:t>
       </w:r>
     </w:p>
     <w:tbl>
@@ -612,21 +521,23 @@
         <w:tblLook w:firstColumn="1" w:firstRow="1" w:lastColumn="0" w:lastRow="0" w:noHBand="0" w:noVBand="1" w:val="04A0"/>
       </w:tblPr>
       <w:tblGrid>
-        <w:gridCol w:w="3255"/>
-        <w:gridCol w:w="3255"/>
-        <w:gridCol w:w="3255"/>
+        <w:gridCol w:w="2412"/>
+        <w:gridCol w:w="2412"/>
+        <w:gridCol w:w="2412"/>
+        <w:gridCol w:w="2412"/>
       </w:tblGrid>
       <w:tr>
         <w:tc>
           <w:tcPr>
             <w:tcW w:type="dxa" w:w="1584"/>
-            <w:shd w:fill="EAF2F8"/>
+            <w:vAlign w:val="center"/>
             <w:tcMar>
-              <w:top w:w="90" w:type="dxa"/>
+              <w:top w:w="80" w:type="dxa"/>
               <w:start w:w="120" w:type="dxa"/>
-              <w:bottom w:w="90" w:type="dxa"/>
+              <w:bottom w:w="80" w:type="dxa"/>
               <w:end w:w="120" w:type="dxa"/>
             </w:tcMar>
+            <w:shd w:fill="E8EEF5"/>
           </w:tcPr>
           <w:p>
             <w:r>
@@ -634,20 +545,21 @@
                 <w:rFonts w:ascii="Calibri" w:hAnsi="Calibri" w:eastAsia="Microsoft YaHei"/>
                 <w:b/>
               </w:rPr>
-              <w:t>操作节点</w:t>
+              <w:t>场景</w:t>
             </w:r>
           </w:p>
         </w:tc>
         <w:tc>
           <w:tcPr>
-            <w:tcW w:type="dxa" w:w="3384"/>
-            <w:shd w:fill="EAF2F8"/>
+            <w:tcW w:type="dxa" w:w="2592"/>
+            <w:vAlign w:val="center"/>
             <w:tcMar>
-              <w:top w:w="90" w:type="dxa"/>
+              <w:top w:w="80" w:type="dxa"/>
               <w:start w:w="120" w:type="dxa"/>
-              <w:bottom w:w="90" w:type="dxa"/>
+              <w:bottom w:w="80" w:type="dxa"/>
               <w:end w:w="120" w:type="dxa"/>
             </w:tcMar>
+            <w:shd w:fill="E8EEF5"/>
           </w:tcPr>
           <w:p>
             <w:r>
@@ -655,20 +567,21 @@
                 <w:rFonts w:ascii="Calibri" w:hAnsi="Calibri" w:eastAsia="Microsoft YaHei"/>
                 <w:b/>
               </w:rPr>
-              <w:t>飞书动作</w:t>
+              <w:t>触发条件</w:t>
             </w:r>
           </w:p>
         </w:tc>
         <w:tc>
           <w:tcPr>
-            <w:tcW w:type="dxa" w:w="4248"/>
-            <w:shd w:fill="EAF2F8"/>
+            <w:tcW w:type="dxa" w:w="3456"/>
+            <w:vAlign w:val="center"/>
             <w:tcMar>
-              <w:top w:w="90" w:type="dxa"/>
+              <w:top w:w="80" w:type="dxa"/>
               <w:start w:w="120" w:type="dxa"/>
-              <w:bottom w:w="90" w:type="dxa"/>
+              <w:bottom w:w="80" w:type="dxa"/>
               <w:end w:w="120" w:type="dxa"/>
             </w:tcMar>
+            <w:shd w:fill="E8EEF5"/>
           </w:tcPr>
           <w:p>
             <w:r>
@@ -676,7 +589,29 @@
                 <w:rFonts w:ascii="Calibri" w:hAnsi="Calibri" w:eastAsia="Microsoft YaHei"/>
                 <w:b/>
               </w:rPr>
-              <w:t>班组确认口径</w:t>
+              <w:t>执行动作</w:t>
+            </w:r>
+          </w:p>
+        </w:tc>
+        <w:tc>
+          <w:tcPr>
+            <w:tcW w:type="dxa" w:w="1728"/>
+            <w:vAlign w:val="center"/>
+            <w:tcMar>
+              <w:top w:w="80" w:type="dxa"/>
+              <w:start w:w="120" w:type="dxa"/>
+              <w:bottom w:w="80" w:type="dxa"/>
+              <w:end w:w="120" w:type="dxa"/>
+            </w:tcMar>
+            <w:shd w:fill="E8EEF5"/>
+          </w:tcPr>
+          <w:p>
+            <w:r>
+              <w:rPr>
+                <w:rFonts w:ascii="Calibri" w:hAnsi="Calibri" w:eastAsia="Microsoft YaHei"/>
+                <w:b/>
+              </w:rPr>
+              <w:t>不得越界</w:t>
             </w:r>
           </w:p>
         </w:tc>
@@ -687,9 +622,9 @@
             <w:tcW w:type="dxa" w:w="1584"/>
             <w:vAlign w:val="center"/>
             <w:tcMar>
-              <w:top w:w="90" w:type="dxa"/>
+              <w:top w:w="80" w:type="dxa"/>
               <w:start w:w="120" w:type="dxa"/>
-              <w:bottom w:w="90" w:type="dxa"/>
+              <w:bottom w:w="80" w:type="dxa"/>
               <w:end w:w="120" w:type="dxa"/>
             </w:tcMar>
           </w:tcPr>
@@ -697,20 +632,20 @@
             <w:r>
               <w:rPr>
                 <w:rFonts w:ascii="Calibri" w:hAnsi="Calibri" w:eastAsia="Microsoft YaHei"/>
-                <w:sz w:val="18"/>
+                <w:sz w:val="19"/>
               </w:rPr>
-              <w:t>方案生成</w:t>
+              <w:t>订单冲刺</w:t>
             </w:r>
           </w:p>
         </w:tc>
         <w:tc>
           <w:tcPr>
-            <w:tcW w:type="dxa" w:w="3384"/>
+            <w:tcW w:type="dxa" w:w="2592"/>
             <w:vAlign w:val="center"/>
             <w:tcMar>
-              <w:top w:w="90" w:type="dxa"/>
+              <w:top w:w="80" w:type="dxa"/>
               <w:start w:w="120" w:type="dxa"/>
-              <w:bottom w:w="90" w:type="dxa"/>
+              <w:bottom w:w="80" w:type="dxa"/>
               <w:end w:w="120" w:type="dxa"/>
             </w:tcMar>
           </w:tcPr>
@@ -718,20 +653,20 @@
             <w:r>
               <w:rPr>
                 <w:rFonts w:ascii="Calibri" w:hAnsi="Calibri" w:eastAsia="Microsoft YaHei"/>
-                <w:sz w:val="18"/>
+                <w:sz w:val="19"/>
               </w:rPr>
-              <w:t>企业发布后，调控师向合成氨当班群发送互动卡片。</w:t>
+              <w:t>下游订单压力高，库存偏低</w:t>
             </w:r>
           </w:p>
         </w:tc>
         <w:tc>
           <w:tcPr>
-            <w:tcW w:type="dxa" w:w="4248"/>
+            <w:tcW w:type="dxa" w:w="3456"/>
             <w:vAlign w:val="center"/>
             <w:tcMar>
-              <w:top w:w="90" w:type="dxa"/>
+              <w:top w:w="80" w:type="dxa"/>
               <w:start w:w="120" w:type="dxa"/>
-              <w:bottom w:w="90" w:type="dxa"/>
+              <w:bottom w:w="80" w:type="dxa"/>
               <w:end w:w="120" w:type="dxa"/>
             </w:tcMar>
           </w:tcPr>
@@ -739,9 +674,30 @@
             <w:r>
               <w:rPr>
                 <w:rFonts w:ascii="Calibri" w:hAnsi="Calibri" w:eastAsia="Microsoft YaHei"/>
-                <w:sz w:val="18"/>
+                <w:sz w:val="19"/>
               </w:rPr>
-              <w:t>核对目标负荷、触发字段、处置状态、撤销条件和与原计划差异。</w:t>
+              <w:t>提高合成负荷，尿浆/复合肥优先，外售降级</w:t>
+            </w:r>
+          </w:p>
+        </w:tc>
+        <w:tc>
+          <w:tcPr>
+            <w:tcW w:type="dxa" w:w="1728"/>
+            <w:vAlign w:val="center"/>
+            <w:tcMar>
+              <w:top w:w="80" w:type="dxa"/>
+              <w:start w:w="120" w:type="dxa"/>
+              <w:bottom w:w="80" w:type="dxa"/>
+              <w:end w:w="120" w:type="dxa"/>
+            </w:tcMar>
+          </w:tcPr>
+          <w:p>
+            <w:r>
+              <w:rPr>
+                <w:rFonts w:ascii="Calibri" w:hAnsi="Calibri" w:eastAsia="Microsoft YaHei"/>
+                <w:sz w:val="19"/>
+              </w:rPr>
+              <w:t>不得低于安全库存</w:t>
             </w:r>
           </w:p>
         </w:tc>
@@ -752,9 +708,9 @@
             <w:tcW w:type="dxa" w:w="1584"/>
             <w:vAlign w:val="center"/>
             <w:tcMar>
-              <w:top w:w="90" w:type="dxa"/>
+              <w:top w:w="80" w:type="dxa"/>
               <w:start w:w="120" w:type="dxa"/>
-              <w:bottom w:w="90" w:type="dxa"/>
+              <w:bottom w:w="80" w:type="dxa"/>
               <w:end w:w="120" w:type="dxa"/>
             </w:tcMar>
           </w:tcPr>
@@ -762,20 +718,20 @@
             <w:r>
               <w:rPr>
                 <w:rFonts w:ascii="Calibri" w:hAnsi="Calibri" w:eastAsia="Microsoft YaHei"/>
-                <w:sz w:val="18"/>
+                <w:sz w:val="19"/>
               </w:rPr>
-              <w:t>条件会签</w:t>
+              <w:t>设备保守</w:t>
             </w:r>
           </w:p>
         </w:tc>
         <w:tc>
           <w:tcPr>
-            <w:tcW w:type="dxa" w:w="3384"/>
+            <w:tcW w:type="dxa" w:w="2592"/>
             <w:vAlign w:val="center"/>
             <w:tcMar>
-              <w:top w:w="90" w:type="dxa"/>
+              <w:top w:w="80" w:type="dxa"/>
               <w:start w:w="120" w:type="dxa"/>
-              <w:bottom w:w="90" w:type="dxa"/>
+              <w:bottom w:w="80" w:type="dxa"/>
               <w:end w:w="120" w:type="dxa"/>
             </w:tcMar>
           </w:tcPr>
@@ -783,20 +739,20 @@
             <w:r>
               <w:rPr>
                 <w:rFonts w:ascii="Calibri" w:hAnsi="Calibri" w:eastAsia="Microsoft YaHei"/>
-                <w:sz w:val="18"/>
+                <w:sz w:val="19"/>
               </w:rPr>
-              <w:t>一般提示不自动升级；设备、公辅、库存等登记条件成立时增加主管和对应专业。</w:t>
+              <w:t>压缩机或合成塔健康评分下降</w:t>
             </w:r>
           </w:p>
         </w:tc>
         <w:tc>
           <w:tcPr>
-            <w:tcW w:type="dxa" w:w="4248"/>
+            <w:tcW w:type="dxa" w:w="3456"/>
             <w:vAlign w:val="center"/>
             <w:tcMar>
-              <w:top w:w="90" w:type="dxa"/>
+              <w:top w:w="80" w:type="dxa"/>
               <w:start w:w="120" w:type="dxa"/>
-              <w:bottom w:w="90" w:type="dxa"/>
+              <w:bottom w:w="80" w:type="dxa"/>
               <w:end w:w="120" w:type="dxa"/>
             </w:tcMar>
           </w:tcPr>
@@ -804,9 +760,30 @@
             <w:r>
               <w:rPr>
                 <w:rFonts w:ascii="Calibri" w:hAnsi="Calibri" w:eastAsia="Microsoft YaHei"/>
-                <w:sz w:val="18"/>
+                <w:sz w:val="19"/>
               </w:rPr>
-              <w:t>未完成所需会签前不写MES计划摘要。</w:t>
+              <w:t>降低负荷上限，插入点检窗口</w:t>
+            </w:r>
+          </w:p>
+        </w:tc>
+        <w:tc>
+          <w:tcPr>
+            <w:tcW w:type="dxa" w:w="1728"/>
+            <w:vAlign w:val="center"/>
+            <w:tcMar>
+              <w:top w:w="80" w:type="dxa"/>
+              <w:start w:w="120" w:type="dxa"/>
+              <w:bottom w:w="80" w:type="dxa"/>
+              <w:end w:w="120" w:type="dxa"/>
+            </w:tcMar>
+          </w:tcPr>
+          <w:p>
+            <w:r>
+              <w:rPr>
+                <w:rFonts w:ascii="Calibri" w:hAnsi="Calibri" w:eastAsia="Microsoft YaHei"/>
+                <w:sz w:val="19"/>
+              </w:rPr>
+              <w:t>不得为追产突破设备边界</w:t>
             </w:r>
           </w:p>
         </w:tc>
@@ -817,9 +794,9 @@
             <w:tcW w:type="dxa" w:w="1584"/>
             <w:vAlign w:val="center"/>
             <w:tcMar>
-              <w:top w:w="90" w:type="dxa"/>
+              <w:top w:w="80" w:type="dxa"/>
               <w:start w:w="120" w:type="dxa"/>
-              <w:bottom w:w="90" w:type="dxa"/>
+              <w:bottom w:w="80" w:type="dxa"/>
               <w:end w:w="120" w:type="dxa"/>
             </w:tcMar>
           </w:tcPr>
@@ -827,20 +804,20 @@
             <w:r>
               <w:rPr>
                 <w:rFonts w:ascii="Calibri" w:hAnsi="Calibri" w:eastAsia="Microsoft YaHei"/>
-                <w:sz w:val="18"/>
+                <w:sz w:val="19"/>
               </w:rPr>
-              <w:t>执行监督</w:t>
+              <w:t>能源错峰</w:t>
             </w:r>
           </w:p>
         </w:tc>
         <w:tc>
           <w:tcPr>
-            <w:tcW w:type="dxa" w:w="3384"/>
+            <w:tcW w:type="dxa" w:w="2592"/>
             <w:vAlign w:val="center"/>
             <w:tcMar>
-              <w:top w:w="90" w:type="dxa"/>
+              <w:top w:w="80" w:type="dxa"/>
               <w:start w:w="120" w:type="dxa"/>
-              <w:bottom w:w="90" w:type="dxa"/>
+              <w:bottom w:w="80" w:type="dxa"/>
               <w:end w:w="120" w:type="dxa"/>
             </w:tcMar>
           </w:tcPr>
@@ -848,20 +825,20 @@
             <w:r>
               <w:rPr>
                 <w:rFonts w:ascii="Calibri" w:hAnsi="Calibri" w:eastAsia="Microsoft YaHei"/>
-                <w:sz w:val="18"/>
+                <w:sz w:val="19"/>
               </w:rPr>
-              <w:t>企业发布后，审批结果触发飞书任务并列出核对清单。</w:t>
+              <w:t>高价能源窗口或蒸汽紧张</w:t>
             </w:r>
           </w:p>
         </w:tc>
         <w:tc>
           <w:tcPr>
-            <w:tcW w:type="dxa" w:w="4248"/>
+            <w:tcW w:type="dxa" w:w="3456"/>
             <w:vAlign w:val="center"/>
             <w:tcMar>
-              <w:top w:w="90" w:type="dxa"/>
+              <w:top w:w="80" w:type="dxa"/>
               <w:start w:w="120" w:type="dxa"/>
-              <w:bottom w:w="90" w:type="dxa"/>
+              <w:bottom w:w="80" w:type="dxa"/>
               <w:end w:w="120" w:type="dxa"/>
             </w:tcMar>
           </w:tcPr>
@@ -869,9 +846,30 @@
             <w:r>
               <w:rPr>
                 <w:rFonts w:ascii="Calibri" w:hAnsi="Calibri" w:eastAsia="Microsoft YaHei"/>
-                <w:sz w:val="18"/>
+                <w:sz w:val="19"/>
               </w:rPr>
-              <w:t>通过生产历史数据库只读数据核对实际负荷、库存和公用工程变化。</w:t>
+              <w:t>高价窗口压产，低价窗口补库存</w:t>
+            </w:r>
+          </w:p>
+        </w:tc>
+        <w:tc>
+          <w:tcPr>
+            <w:tcW w:type="dxa" w:w="1728"/>
+            <w:vAlign w:val="center"/>
+            <w:tcMar>
+              <w:top w:w="80" w:type="dxa"/>
+              <w:start w:w="120" w:type="dxa"/>
+              <w:bottom w:w="80" w:type="dxa"/>
+              <w:end w:w="120" w:type="dxa"/>
+            </w:tcMar>
+          </w:tcPr>
+          <w:p>
+            <w:r>
+              <w:rPr>
+                <w:rFonts w:ascii="Calibri" w:hAnsi="Calibri" w:eastAsia="Microsoft YaHei"/>
+                <w:sz w:val="19"/>
+              </w:rPr>
+              <w:t>不得影响刚性交付和安全库存</w:t>
             </w:r>
           </w:p>
         </w:tc>
@@ -882,9 +880,9 @@
             <w:tcW w:type="dxa" w:w="1584"/>
             <w:vAlign w:val="center"/>
             <w:tcMar>
-              <w:top w:w="90" w:type="dxa"/>
+              <w:top w:w="80" w:type="dxa"/>
               <w:start w:w="120" w:type="dxa"/>
-              <w:bottom w:w="90" w:type="dxa"/>
+              <w:bottom w:w="80" w:type="dxa"/>
               <w:end w:w="120" w:type="dxa"/>
             </w:tcMar>
           </w:tcPr>
@@ -892,20 +890,20 @@
             <w:r>
               <w:rPr>
                 <w:rFonts w:ascii="Calibri" w:hAnsi="Calibri" w:eastAsia="Microsoft YaHei"/>
-                <w:sz w:val="18"/>
+                <w:sz w:val="19"/>
               </w:rPr>
-              <w:t>班后记录</w:t>
+              <w:t>低置信</w:t>
             </w:r>
           </w:p>
         </w:tc>
         <w:tc>
           <w:tcPr>
-            <w:tcW w:type="dxa" w:w="3384"/>
+            <w:tcW w:type="dxa" w:w="2592"/>
             <w:vAlign w:val="center"/>
             <w:tcMar>
-              <w:top w:w="90" w:type="dxa"/>
+              <w:top w:w="80" w:type="dxa"/>
               <w:start w:w="120" w:type="dxa"/>
-              <w:bottom w:w="90" w:type="dxa"/>
+              <w:bottom w:w="80" w:type="dxa"/>
               <w:end w:w="120" w:type="dxa"/>
             </w:tcMar>
           </w:tcPr>
@@ -913,20 +911,20 @@
             <w:r>
               <w:rPr>
                 <w:rFonts w:ascii="Calibri" w:hAnsi="Calibri" w:eastAsia="Microsoft YaHei"/>
-                <w:sz w:val="18"/>
+                <w:sz w:val="19"/>
               </w:rPr>
-              <w:t>复盘字段写入飞书多维表格，未采纳原因进入待审核案例库。</w:t>
+              <w:t>数据缺失、模型偏差或市场异常</w:t>
             </w:r>
           </w:p>
         </w:tc>
         <w:tc>
           <w:tcPr>
-            <w:tcW w:type="dxa" w:w="4248"/>
+            <w:tcW w:type="dxa" w:w="3456"/>
             <w:vAlign w:val="center"/>
             <w:tcMar>
-              <w:top w:w="90" w:type="dxa"/>
+              <w:top w:w="80" w:type="dxa"/>
               <w:start w:w="120" w:type="dxa"/>
-              <w:bottom w:w="90" w:type="dxa"/>
+              <w:bottom w:w="80" w:type="dxa"/>
               <w:end w:w="120" w:type="dxa"/>
             </w:tcMar>
           </w:tcPr>
@@ -934,9 +932,30 @@
             <w:r>
               <w:rPr>
                 <w:rFonts w:ascii="Calibri" w:hAnsi="Calibri" w:eastAsia="Microsoft YaHei"/>
-                <w:sz w:val="18"/>
+                <w:sz w:val="19"/>
               </w:rPr>
-              <w:t>记录不采纳原因和执行偏差，由专业人员决定是否修订规则。</w:t>
+              <w:t>退回规则方案和人工流程</w:t>
+            </w:r>
+          </w:p>
+        </w:tc>
+        <w:tc>
+          <w:tcPr>
+            <w:tcW w:type="dxa" w:w="1728"/>
+            <w:vAlign w:val="center"/>
+            <w:tcMar>
+              <w:top w:w="80" w:type="dxa"/>
+              <w:start w:w="120" w:type="dxa"/>
+              <w:bottom w:w="80" w:type="dxa"/>
+              <w:end w:w="120" w:type="dxa"/>
+            </w:tcMar>
+          </w:tcPr>
+          <w:p>
+            <w:r>
+              <w:rPr>
+                <w:rFonts w:ascii="Calibri" w:hAnsi="Calibri" w:eastAsia="Microsoft YaHei"/>
+                <w:sz w:val="19"/>
+              </w:rPr>
+              <w:t>不得自动回写 MES</w:t>
             </w:r>
           </w:p>
         </w:tc>
@@ -944,10 +963,133 @@
     </w:tbl>
     <w:p>
       <w:pPr>
-        <w:pStyle w:val="Heading2"/>
+        <w:pStyle w:val="Heading1"/>
       </w:pPr>
       <w:r>
-        <w:t>2（一）条件驱动处置</w:t>
+        <w:t>4. 交接班摘要模板</w:t>
+      </w:r>
+    </w:p>
+    <w:p>
+      <w:pPr>
+        <w:pStyle w:val="ListBullet"/>
+      </w:pPr>
+      <w:r>
+        <w:rPr>
+          <w:rFonts w:ascii="Calibri" w:hAnsi="Calibri" w:eastAsia="Microsoft YaHei"/>
+        </w:rPr>
+        <w:t>目标负荷：__%；运行模式：稳态/冲刺/保守。</w:t>
+      </w:r>
+    </w:p>
+    <w:p>
+      <w:pPr>
+        <w:pStyle w:val="ListBullet"/>
+      </w:pPr>
+      <w:r>
+        <w:rPr>
+          <w:rFonts w:ascii="Calibri" w:hAnsi="Calibri" w:eastAsia="Microsoft YaHei"/>
+        </w:rPr>
+        <w:t>优先订单：尿浆/复合肥/液氨外售/联碱配套。</w:t>
+      </w:r>
+    </w:p>
+    <w:p>
+      <w:pPr>
+        <w:pStyle w:val="ListBullet"/>
+      </w:pPr>
+      <w:r>
+        <w:rPr>
+          <w:rFonts w:ascii="Calibri" w:hAnsi="Calibri" w:eastAsia="Microsoft YaHei"/>
+        </w:rPr>
+        <w:t>关键约束：库存、压缩机、合成塔、罐区、能源窗口、环保指标。</w:t>
+      </w:r>
+    </w:p>
+    <w:p>
+      <w:pPr>
+        <w:pStyle w:val="ListBullet"/>
+      </w:pPr>
+      <w:r>
+        <w:rPr>
+          <w:rFonts w:ascii="Calibri" w:hAnsi="Calibri" w:eastAsia="Microsoft YaHei"/>
+        </w:rPr>
+        <w:t>审批要求：班长确认/班长 + 调度主管双确认。</w:t>
+      </w:r>
+    </w:p>
+    <w:p>
+      <w:pPr>
+        <w:pStyle w:val="ListBullet"/>
+      </w:pPr>
+      <w:r>
+        <w:rPr>
+          <w:rFonts w:ascii="Calibri" w:hAnsi="Calibri" w:eastAsia="Microsoft YaHei"/>
+        </w:rPr>
+        <w:t>未采纳原因：安全边界、设备风险、订单变化、数据不可信、经验判断。</w:t>
+      </w:r>
+    </w:p>
+    <w:p>
+      <w:pPr>
+        <w:pStyle w:val="Heading1"/>
+      </w:pPr>
+      <w:r>
+        <w:t>5. 调控师判断原则</w:t>
+      </w:r>
+    </w:p>
+    <w:p>
+      <w:pPr>
+        <w:pStyle w:val="ListNumber"/>
+      </w:pPr>
+      <w:r>
+        <w:rPr>
+          <w:rFonts w:ascii="Calibri" w:hAnsi="Calibri" w:eastAsia="Microsoft YaHei"/>
+        </w:rPr>
+        <w:t>先安全后收益：任何收益测算都不能覆盖安环和设备硬边界。</w:t>
+      </w:r>
+    </w:p>
+    <w:p>
+      <w:pPr>
+        <w:pStyle w:val="ListNumber"/>
+      </w:pPr>
+      <w:r>
+        <w:rPr>
+          <w:rFonts w:ascii="Calibri" w:hAnsi="Calibri" w:eastAsia="Microsoft YaHei"/>
+        </w:rPr>
+        <w:t>先小闭环后推广：一个班次链路跑通，再谈全厂协同。</w:t>
+      </w:r>
+    </w:p>
+    <w:p>
+      <w:pPr>
+        <w:pStyle w:val="ListNumber"/>
+      </w:pPr>
+      <w:r>
+        <w:rPr>
+          <w:rFonts w:ascii="Calibri" w:hAnsi="Calibri" w:eastAsia="Microsoft YaHei"/>
+        </w:rPr>
+        <w:t>先解释后执行：无法解释触发约束的方案不得采纳。</w:t>
+      </w:r>
+    </w:p>
+    <w:p>
+      <w:pPr>
+        <w:pStyle w:val="ListNumber"/>
+      </w:pPr>
+      <w:r>
+        <w:rPr>
+          <w:rFonts w:ascii="Calibri" w:hAnsi="Calibri" w:eastAsia="Microsoft YaHei"/>
+        </w:rPr>
+        <w:t>先复盘后迭代：未采纳原因比采纳原因更能提升模型。</w:t>
+      </w:r>
+    </w:p>
+    <w:p>
+      <w:pPr>
+        <w:pStyle w:val="Heading1"/>
+      </w:pPr>
+      <w:r>
+        <w:t>6. 网页第一次使用说明</w:t>
+      </w:r>
+    </w:p>
+    <w:p>
+      <w:r>
+        <w:rPr>
+          <w:rFonts w:ascii="Calibri" w:hAnsi="Calibri" w:eastAsia="Microsoft YaHei"/>
+        </w:rPr>
+        <w:t>网页是调度工作台的演练入口，不是DCS画面。第一次使用时先点击“稳氨”，再按“当班态势—产供销平衡—稳产预警—执行复盘”的顺序查看。页面顶部的“使用说明”提供逐项组件解释，适合向不了解合成氨的人员讲解。</w:t>
       </w:r>
     </w:p>
     <w:tbl>
@@ -959,22 +1101,23 @@
         <w:tblLook w:firstColumn="1" w:firstRow="1" w:lastColumn="0" w:lastRow="0" w:noHBand="0" w:noVBand="1" w:val="04A0"/>
       </w:tblPr>
       <w:tblGrid>
-        <w:gridCol w:w="2441"/>
-        <w:gridCol w:w="2441"/>
-        <w:gridCol w:w="2441"/>
-        <w:gridCol w:w="2441"/>
+        <w:gridCol w:w="2412"/>
+        <w:gridCol w:w="2412"/>
+        <w:gridCol w:w="2412"/>
+        <w:gridCol w:w="2412"/>
       </w:tblGrid>
       <w:tr>
         <w:tc>
           <w:tcPr>
-            <w:tcW w:type="dxa" w:w="1440"/>
-            <w:shd w:fill="EAF2F8"/>
+            <w:tcW w:type="dxa" w:w="1800"/>
+            <w:vAlign w:val="center"/>
             <w:tcMar>
-              <w:top w:w="90" w:type="dxa"/>
+              <w:top w:w="80" w:type="dxa"/>
               <w:start w:w="120" w:type="dxa"/>
-              <w:bottom w:w="90" w:type="dxa"/>
+              <w:bottom w:w="80" w:type="dxa"/>
               <w:end w:w="120" w:type="dxa"/>
             </w:tcMar>
+            <w:shd w:fill="E8EEF5"/>
           </w:tcPr>
           <w:p>
             <w:r>
@@ -982,20 +1125,21 @@
                 <w:rFonts w:ascii="Calibri" w:hAnsi="Calibri" w:eastAsia="Microsoft YaHei"/>
                 <w:b/>
               </w:rPr>
-              <w:t>处置</w:t>
+              <w:t>页面组件</w:t>
             </w:r>
           </w:p>
         </w:tc>
         <w:tc>
           <w:tcPr>
-            <w:tcW w:type="dxa" w:w="3528"/>
-            <w:shd w:fill="EAF2F8"/>
+            <w:tcW w:type="dxa" w:w="2592"/>
+            <w:vAlign w:val="center"/>
             <w:tcMar>
-              <w:top w:w="90" w:type="dxa"/>
+              <w:top w:w="80" w:type="dxa"/>
               <w:start w:w="120" w:type="dxa"/>
-              <w:bottom w:w="90" w:type="dxa"/>
+              <w:bottom w:w="80" w:type="dxa"/>
               <w:end w:w="120" w:type="dxa"/>
             </w:tcMar>
+            <w:shd w:fill="E8EEF5"/>
           </w:tcPr>
           <w:p>
             <w:r>
@@ -1003,93 +1147,7 @@
                 <w:rFonts w:ascii="Calibri" w:hAnsi="Calibri" w:eastAsia="Microsoft YaHei"/>
                 <w:b/>
               </w:rPr>
-              <w:t>明确条件</w:t>
-            </w:r>
-          </w:p>
-        </w:tc>
-        <w:tc>
-          <w:tcPr>
-            <w:tcW w:type="dxa" w:w="3096"/>
-            <w:shd w:fill="EAF2F8"/>
-            <w:tcMar>
-              <w:top w:w="90" w:type="dxa"/>
-              <w:start w:w="120" w:type="dxa"/>
-              <w:bottom w:w="90" w:type="dxa"/>
-              <w:end w:w="120" w:type="dxa"/>
-            </w:tcMar>
-          </w:tcPr>
-          <w:p>
-            <w:r>
-              <w:rPr>
-                <w:rFonts w:ascii="Calibri" w:hAnsi="Calibri" w:eastAsia="Microsoft YaHei"/>
-                <w:b/>
-              </w:rPr>
-              <w:t>系统动作</w:t>
-            </w:r>
-          </w:p>
-        </w:tc>
-        <w:tc>
-          <w:tcPr>
-            <w:tcW w:type="dxa" w:w="1152"/>
-            <w:shd w:fill="EAF2F8"/>
-            <w:tcMar>
-              <w:top w:w="90" w:type="dxa"/>
-              <w:start w:w="120" w:type="dxa"/>
-              <w:bottom w:w="90" w:type="dxa"/>
-              <w:end w:w="120" w:type="dxa"/>
-            </w:tcMar>
-          </w:tcPr>
-          <w:p>
-            <w:r>
-              <w:rPr>
-                <w:rFonts w:ascii="Calibri" w:hAnsi="Calibri" w:eastAsia="Microsoft YaHei"/>
-                <w:b/>
-              </w:rPr>
-              <w:t>责任岗位</w:t>
-            </w:r>
-          </w:p>
-        </w:tc>
-      </w:tr>
-      <w:tr>
-        <w:tc>
-          <w:tcPr>
-            <w:tcW w:type="dxa" w:w="1440"/>
-            <w:vAlign w:val="center"/>
-            <w:tcMar>
-              <w:top w:w="90" w:type="dxa"/>
-              <w:start w:w="120" w:type="dxa"/>
-              <w:bottom w:w="90" w:type="dxa"/>
-              <w:end w:w="120" w:type="dxa"/>
-            </w:tcMar>
-          </w:tcPr>
-          <w:p>
-            <w:r>
-              <w:rPr>
-                <w:rFonts w:ascii="Calibri" w:hAnsi="Calibri" w:eastAsia="Microsoft YaHei"/>
-                <w:sz w:val="18"/>
-              </w:rPr>
-              <w:t>一般提示</w:t>
-            </w:r>
-          </w:p>
-        </w:tc>
-        <w:tc>
-          <w:tcPr>
-            <w:tcW w:type="dxa" w:w="3528"/>
-            <w:vAlign w:val="center"/>
-            <w:tcMar>
-              <w:top w:w="90" w:type="dxa"/>
-              <w:start w:w="120" w:type="dxa"/>
-              <w:bottom w:w="90" w:type="dxa"/>
-              <w:end w:w="120" w:type="dxa"/>
-            </w:tcMar>
-          </w:tcPr>
-          <w:p>
-            <w:r>
-              <w:rPr>
-                <w:rFonts w:ascii="Calibri" w:hAnsi="Calibri" w:eastAsia="Microsoft YaHei"/>
-                <w:sz w:val="18"/>
-              </w:rPr>
-              <w:t>数据有效，且未命中专业会签条件或演练停算线</w:t>
+              <w:t>它解决什么问题</w:t>
             </w:r>
           </w:p>
         </w:tc>
@@ -1098,9 +1156,55 @@
             <w:tcW w:type="dxa" w:w="3096"/>
             <w:vAlign w:val="center"/>
             <w:tcMar>
-              <w:top w:w="90" w:type="dxa"/>
+              <w:top w:w="80" w:type="dxa"/>
               <w:start w:w="120" w:type="dxa"/>
-              <w:bottom w:w="90" w:type="dxa"/>
+              <w:bottom w:w="80" w:type="dxa"/>
+              <w:end w:w="120" w:type="dxa"/>
+            </w:tcMar>
+            <w:shd w:fill="E8EEF5"/>
+          </w:tcPr>
+          <w:p>
+            <w:r>
+              <w:rPr>
+                <w:rFonts w:ascii="Calibri" w:hAnsi="Calibri" w:eastAsia="Microsoft YaHei"/>
+                <w:b/>
+              </w:rPr>
+              <w:t>第一次怎么用</w:t>
+            </w:r>
+          </w:p>
+        </w:tc>
+        <w:tc>
+          <w:tcPr>
+            <w:tcW w:type="dxa" w:w="2376"/>
+            <w:vAlign w:val="center"/>
+            <w:tcMar>
+              <w:top w:w="80" w:type="dxa"/>
+              <w:start w:w="120" w:type="dxa"/>
+              <w:bottom w:w="80" w:type="dxa"/>
+              <w:end w:w="120" w:type="dxa"/>
+            </w:tcMar>
+            <w:shd w:fill="E8EEF5"/>
+          </w:tcPr>
+          <w:p>
+            <w:r>
+              <w:rPr>
+                <w:rFonts w:ascii="Calibri" w:hAnsi="Calibri" w:eastAsia="Microsoft YaHei"/>
+                <w:b/>
+              </w:rPr>
+              <w:t>结果如何理解</w:t>
+            </w:r>
+          </w:p>
+        </w:tc>
+      </w:tr>
+      <w:tr>
+        <w:tc>
+          <w:tcPr>
+            <w:tcW w:type="dxa" w:w="1800"/>
+            <w:vAlign w:val="center"/>
+            <w:tcMar>
+              <w:top w:w="80" w:type="dxa"/>
+              <w:start w:w="120" w:type="dxa"/>
+              <w:bottom w:w="80" w:type="dxa"/>
               <w:end w:w="120" w:type="dxa"/>
             </w:tcMar>
           </w:tcPr>
@@ -1108,20 +1212,20 @@
             <w:r>
               <w:rPr>
                 <w:rFonts w:ascii="Calibri" w:hAnsi="Calibri" w:eastAsia="Microsoft YaHei"/>
-                <w:sz w:val="18"/>
+                <w:sz w:val="19"/>
               </w:rPr>
-              <w:t>显示具体偏差、持续时间和核对事项；不自动创建审批</w:t>
+              <w:t>场景按钮</w:t>
             </w:r>
           </w:p>
         </w:tc>
         <w:tc>
           <w:tcPr>
-            <w:tcW w:type="dxa" w:w="1152"/>
+            <w:tcW w:type="dxa" w:w="2592"/>
             <w:vAlign w:val="center"/>
             <w:tcMar>
-              <w:top w:w="90" w:type="dxa"/>
+              <w:top w:w="80" w:type="dxa"/>
               <w:start w:w="120" w:type="dxa"/>
-              <w:bottom w:w="90" w:type="dxa"/>
+              <w:bottom w:w="80" w:type="dxa"/>
               <w:end w:w="120" w:type="dxa"/>
             </w:tcMar>
           </w:tcPr>
@@ -1129,53 +1233,9 @@
             <w:r>
               <w:rPr>
                 <w:rFonts w:ascii="Calibri" w:hAnsi="Calibri" w:eastAsia="Microsoft YaHei"/>
-                <w:sz w:val="18"/>
+                <w:sz w:val="19"/>
               </w:rPr>
-              <w:t>调度员</w:t>
-            </w:r>
-          </w:p>
-        </w:tc>
-      </w:tr>
-      <w:tr>
-        <w:tc>
-          <w:tcPr>
-            <w:tcW w:type="dxa" w:w="1440"/>
-            <w:vAlign w:val="center"/>
-            <w:tcMar>
-              <w:top w:w="90" w:type="dxa"/>
-              <w:start w:w="120" w:type="dxa"/>
-              <w:bottom w:w="90" w:type="dxa"/>
-              <w:end w:w="120" w:type="dxa"/>
-            </w:tcMar>
-          </w:tcPr>
-          <w:p>
-            <w:r>
-              <w:rPr>
-                <w:rFonts w:ascii="Calibri" w:hAnsi="Calibri" w:eastAsia="Microsoft YaHei"/>
-                <w:sz w:val="18"/>
-              </w:rPr>
-              <w:t>相关专业会签</w:t>
-            </w:r>
-          </w:p>
-        </w:tc>
-        <w:tc>
-          <w:tcPr>
-            <w:tcW w:type="dxa" w:w="3528"/>
-            <w:vAlign w:val="center"/>
-            <w:tcMar>
-              <w:top w:w="90" w:type="dxa"/>
-              <w:start w:w="120" w:type="dxa"/>
-              <w:bottom w:w="90" w:type="dxa"/>
-              <w:end w:w="120" w:type="dxa"/>
-            </w:tcMar>
-          </w:tcPr>
-          <w:p>
-            <w:r>
-              <w:rPr>
-                <w:rFonts w:ascii="Calibri" w:hAnsi="Calibri" w:eastAsia="Microsoft YaHei"/>
-                <w:sz w:val="18"/>
-              </w:rPr>
-              <w:t>设备趋势达到specialist_review条件，公辅余量异常或失效，库存接近确认边界，或其他已登记条件成立</w:t>
+              <w:t>回放稳态、保供、护机、错峰等班次矛盾</w:t>
             </w:r>
           </w:p>
         </w:tc>
@@ -1184,9 +1244,9 @@
             <w:tcW w:type="dxa" w:w="3096"/>
             <w:vAlign w:val="center"/>
             <w:tcMar>
-              <w:top w:w="90" w:type="dxa"/>
+              <w:top w:w="80" w:type="dxa"/>
               <w:start w:w="120" w:type="dxa"/>
-              <w:bottom w:w="90" w:type="dxa"/>
+              <w:bottom w:w="80" w:type="dxa"/>
               <w:end w:w="120" w:type="dxa"/>
             </w:tcMar>
           </w:tcPr>
@@ -1194,20 +1254,20 @@
             <w:r>
               <w:rPr>
                 <w:rFonts w:ascii="Calibri" w:hAnsi="Calibri" w:eastAsia="Microsoft YaHei"/>
-                <w:sz w:val="18"/>
+                <w:sz w:val="19"/>
               </w:rPr>
-              <w:t>显示触发字段、时间窗、质量状态和规则版本，通知对应专业</w:t>
+              <w:t>点击一个场景，不要同时拖动多个滑块</w:t>
             </w:r>
           </w:p>
         </w:tc>
         <w:tc>
           <w:tcPr>
-            <w:tcW w:type="dxa" w:w="1152"/>
+            <w:tcW w:type="dxa" w:w="2376"/>
             <w:vAlign w:val="center"/>
             <w:tcMar>
-              <w:top w:w="90" w:type="dxa"/>
+              <w:top w:w="80" w:type="dxa"/>
               <w:start w:w="120" w:type="dxa"/>
-              <w:bottom w:w="90" w:type="dxa"/>
+              <w:bottom w:w="80" w:type="dxa"/>
               <w:end w:w="120" w:type="dxa"/>
             </w:tcMar>
           </w:tcPr>
@@ -1215,9 +1275,9 @@
             <w:r>
               <w:rPr>
                 <w:rFonts w:ascii="Calibri" w:hAnsi="Calibri" w:eastAsia="Microsoft YaHei"/>
-                <w:sz w:val="18"/>
+                <w:sz w:val="19"/>
               </w:rPr>
-              <w:t>设备、公辅、罐区或工艺专业</w:t>
+              <w:t>只是样例条件，不是生产命令</w:t>
             </w:r>
           </w:p>
         </w:tc>
@@ -1225,12 +1285,12 @@
       <w:tr>
         <w:tc>
           <w:tcPr>
-            <w:tcW w:type="dxa" w:w="1440"/>
+            <w:tcW w:type="dxa" w:w="1800"/>
             <w:vAlign w:val="center"/>
             <w:tcMar>
-              <w:top w:w="90" w:type="dxa"/>
+              <w:top w:w="80" w:type="dxa"/>
               <w:start w:w="120" w:type="dxa"/>
-              <w:bottom w:w="90" w:type="dxa"/>
+              <w:bottom w:w="80" w:type="dxa"/>
               <w:end w:w="120" w:type="dxa"/>
             </w:tcMar>
           </w:tcPr>
@@ -1238,20 +1298,20 @@
             <w:r>
               <w:rPr>
                 <w:rFonts w:ascii="Calibri" w:hAnsi="Calibri" w:eastAsia="Microsoft YaHei"/>
-                <w:sz w:val="18"/>
+                <w:sz w:val="19"/>
               </w:rPr>
-              <w:t>演练停算线</w:t>
+              <w:t>沙盘滑块</w:t>
             </w:r>
           </w:p>
         </w:tc>
         <w:tc>
           <w:tcPr>
-            <w:tcW w:type="dxa" w:w="3528"/>
+            <w:tcW w:type="dxa" w:w="2592"/>
             <w:vAlign w:val="center"/>
             <w:tcMar>
-              <w:top w:w="90" w:type="dxa"/>
+              <w:top w:w="80" w:type="dxa"/>
               <w:start w:w="120" w:type="dxa"/>
-              <w:bottom w:w="90" w:type="dxa"/>
+              <w:bottom w:w="80" w:type="dxa"/>
               <w:end w:w="120" w:type="dxa"/>
             </w:tcMar>
           </w:tcPr>
@@ -1259,9 +1319,9 @@
             <w:r>
               <w:rPr>
                 <w:rFonts w:ascii="Calibri" w:hAnsi="Calibri" w:eastAsia="Microsoft YaHei"/>
-                <w:sz w:val="18"/>
+                <w:sz w:val="19"/>
               </w:rPr>
-              <w:t>趋势回放标记stop_new_recommendation_demo，或接口矩阵登记的停算条件成立</w:t>
+              <w:t>模拟订单、能源、设备、库存和行情变化</w:t>
             </w:r>
           </w:p>
         </w:tc>
@@ -1270,9 +1330,9 @@
             <w:tcW w:type="dxa" w:w="3096"/>
             <w:vAlign w:val="center"/>
             <w:tcMar>
-              <w:top w:w="90" w:type="dxa"/>
+              <w:top w:w="80" w:type="dxa"/>
               <w:start w:w="120" w:type="dxa"/>
-              <w:bottom w:w="90" w:type="dxa"/>
+              <w:bottom w:w="80" w:type="dxa"/>
               <w:end w:w="120" w:type="dxa"/>
             </w:tcMar>
           </w:tcPr>
@@ -1280,20 +1340,20 @@
             <w:r>
               <w:rPr>
                 <w:rFonts w:ascii="Calibri" w:hAnsi="Calibri" w:eastAsia="Microsoft YaHei"/>
-                <w:sz w:val="18"/>
+                <w:sz w:val="19"/>
               </w:rPr>
-              <w:t>停止新目标、经济排序、动作单和审批；维持最近批准方案并转现场规程</w:t>
+              <w:t>一次调整一个变量，再看建议和事件变化</w:t>
             </w:r>
           </w:p>
         </w:tc>
         <w:tc>
           <w:tcPr>
-            <w:tcW w:type="dxa" w:w="1152"/>
+            <w:tcW w:type="dxa" w:w="2376"/>
             <w:vAlign w:val="center"/>
             <w:tcMar>
-              <w:top w:w="90" w:type="dxa"/>
+              <w:top w:w="80" w:type="dxa"/>
               <w:start w:w="120" w:type="dxa"/>
-              <w:bottom w:w="90" w:type="dxa"/>
+              <w:bottom w:w="80" w:type="dxa"/>
               <w:end w:w="120" w:type="dxa"/>
             </w:tcMar>
           </w:tcPr>
@@ -1301,159 +1361,22 @@
             <w:r>
               <w:rPr>
                 <w:rFonts w:ascii="Calibri" w:hAnsi="Calibri" w:eastAsia="Microsoft YaHei"/>
-                <w:sz w:val="18"/>
+                <w:sz w:val="19"/>
               </w:rPr>
-              <w:t>现场指挥链与对应专业</w:t>
+              <w:t>用于验证逻辑，不代表现场实时值</w:t>
             </w:r>
           </w:p>
         </w:tc>
       </w:tr>
-    </w:tbl>
-    <w:p>
-      <w:r>
-        <w:rPr>
-          <w:rFonts w:ascii="Calibri" w:hAnsi="Calibri" w:eastAsia="Microsoft YaHei"/>
-        </w:rPr>
-        <w:t>命中演练停算线时，立即停止新目标、经济排序、动作单和审批，维持最近批准方案并转现场规程；解除条件由对应专业确认后再冻结新快照。</w:t>
-      </w:r>
-    </w:p>
-    <w:p>
-      <w:pPr>
-        <w:pStyle w:val="Heading1"/>
-      </w:pPr>
-      <w:r>
-        <w:t>3. 异常处理原则</w:t>
-      </w:r>
-    </w:p>
-    <w:p>
-      <w:pPr>
-        <w:pStyle w:val="ListNumber"/>
-        <w:numPr>
-          <w:ilvl w:val="0"/>
-          <w:numId w:val="11"/>
-        </w:numPr>
-      </w:pPr>
-      <w:r>
-        <w:rPr>
-          <w:rFonts w:ascii="Calibri" w:hAnsi="Calibri" w:eastAsia="Microsoft YaHei"/>
-        </w:rPr>
-        <w:t>安全与设备限值接近时，停止给出经济性负荷建议，保留原计划并提示人工处置。</w:t>
-      </w:r>
-    </w:p>
-    <w:p>
-      <w:pPr>
-        <w:pStyle w:val="ListNumber"/>
-        <w:numPr>
-          <w:ilvl w:val="0"/>
-          <w:numId w:val="11"/>
-        </w:numPr>
-      </w:pPr>
-      <w:r>
-        <w:rPr>
-          <w:rFonts w:ascii="Calibri" w:hAnsi="Calibri" w:eastAsia="Microsoft YaHei"/>
-        </w:rPr>
-        <w:t>下游异常、公用工程约束或能源条件变化时，先核对气化、净化、合成和液氨去向的连续性。</w:t>
-      </w:r>
-    </w:p>
-    <w:p>
-      <w:pPr>
-        <w:pStyle w:val="ListNumber"/>
-        <w:numPr>
-          <w:ilvl w:val="0"/>
-          <w:numId w:val="11"/>
-        </w:numPr>
-      </w:pPr>
-      <w:r>
-        <w:rPr>
-          <w:rFonts w:ascii="Calibri" w:hAnsi="Calibri" w:eastAsia="Microsoft YaHei"/>
-        </w:rPr>
-        <w:t>确需停运时，比较候选装置的重启时间、废料、人员和物料损失；既往案例只作提示，最终由相关人员会签。</w:t>
-      </w:r>
-    </w:p>
-    <w:p>
-      <w:pPr>
-        <w:pStyle w:val="ListNumber"/>
-        <w:numPr>
-          <w:ilvl w:val="0"/>
-          <w:numId w:val="11"/>
-        </w:numPr>
-      </w:pPr>
-      <w:r>
-        <w:rPr>
-          <w:rFonts w:ascii="Calibri" w:hAnsi="Calibri" w:eastAsia="Microsoft YaHei"/>
-        </w:rPr>
-        <w:t>无法说明触发数据、约束、贡献测算和撤销条件的建议不得提交审批。</w:t>
-      </w:r>
-    </w:p>
-    <w:p>
-      <w:pPr>
-        <w:pStyle w:val="ListNumber"/>
-        <w:numPr>
-          <w:ilvl w:val="0"/>
-          <w:numId w:val="11"/>
-        </w:numPr>
-      </w:pPr>
-      <w:r>
-        <w:rPr>
-          <w:rFonts w:ascii="Calibri" w:hAnsi="Calibri" w:eastAsia="Microsoft YaHei"/>
-        </w:rPr>
-        <w:t>任何负荷调整均由班组按现行操作票和审批制度执行；平台不写DCS/SIS，也不自动开停车。</w:t>
-      </w:r>
-    </w:p>
-    <w:p>
-      <w:pPr>
-        <w:pStyle w:val="ListNumber"/>
-        <w:numPr>
-          <w:ilvl w:val="0"/>
-          <w:numId w:val="11"/>
-        </w:numPr>
-      </w:pPr>
-      <w:r>
-        <w:rPr>
-          <w:rFonts w:ascii="Calibri" w:hAnsi="Calibri" w:eastAsia="Microsoft YaHei"/>
-        </w:rPr>
-        <w:t>班后记录先进入待审核案例库，审核通过后才可修订规则或纳入训练样本。</w:t>
-      </w:r>
-    </w:p>
-    <w:p>
-      <w:pPr>
-        <w:pStyle w:val="Heading1"/>
-      </w:pPr>
-      <w:r>
-        <w:t>4. 审批后的跨装置动作单</w:t>
-      </w:r>
-    </w:p>
-    <w:p>
-      <w:r>
-        <w:rPr>
-          <w:rFonts w:ascii="Calibri" w:hAnsi="Calibri" w:eastAsia="Microsoft YaHei"/>
-        </w:rPr>
-        <w:t>审批通过后生成跨装置调度动作单，由合成主操、硝酸主操、罐区/调度和公辅调度分别接令。四个岗位全部接令后才可进入执行跟踪；接令只表示收到有效方案并确认责任，不表示现场已经执行。</w:t>
-      </w:r>
-    </w:p>
-    <w:tbl>
-      <w:tblPr>
-        <w:tblStyle w:val="TableGrid"/>
-        <w:tblW w:type="auto" w:w="0"/>
-        <w:jc w:val="center"/>
-        <w:tblLayout w:type="fixed"/>
-        <w:tblLook w:firstColumn="1" w:firstRow="1" w:lastColumn="0" w:lastRow="0" w:noHBand="0" w:noVBand="1" w:val="04A0"/>
-      </w:tblPr>
-      <w:tblGrid>
-        <w:gridCol w:w="2441"/>
-        <w:gridCol w:w="2441"/>
-        <w:gridCol w:w="2441"/>
-        <w:gridCol w:w="2441"/>
-      </w:tblGrid>
       <w:tr>
         <w:tc>
           <w:tcPr>
-            <w:tcW w:type="dxa" w:w="1440"/>
-            <w:shd w:fill="EAF2F8"/>
+            <w:tcW w:type="dxa" w:w="1800"/>
+            <w:vAlign w:val="center"/>
             <w:tcMar>
-              <w:top w:w="90" w:type="dxa"/>
+              <w:top w:w="80" w:type="dxa"/>
               <w:start w:w="120" w:type="dxa"/>
-              <w:bottom w:w="90" w:type="dxa"/>
+              <w:bottom w:w="80" w:type="dxa"/>
               <w:end w:w="120" w:type="dxa"/>
             </w:tcMar>
           </w:tcPr>
@@ -1461,20 +1384,20 @@
             <w:r>
               <w:rPr>
                 <w:rFonts w:ascii="Calibri" w:hAnsi="Calibri" w:eastAsia="Microsoft YaHei"/>
-                <w:b/>
+                <w:sz w:val="19"/>
               </w:rPr>
-              <w:t>接令岗位</w:t>
+              <w:t>行情闸门</w:t>
             </w:r>
           </w:p>
         </w:tc>
         <w:tc>
           <w:tcPr>
-            <w:tcW w:type="dxa" w:w="3024"/>
-            <w:shd w:fill="EAF2F8"/>
+            <w:tcW w:type="dxa" w:w="2592"/>
+            <w:vAlign w:val="center"/>
             <w:tcMar>
-              <w:top w:w="90" w:type="dxa"/>
+              <w:top w:w="80" w:type="dxa"/>
               <w:start w:w="120" w:type="dxa"/>
-              <w:bottom w:w="90" w:type="dxa"/>
+              <w:bottom w:w="80" w:type="dxa"/>
               <w:end w:w="120" w:type="dxa"/>
             </w:tcMar>
           </w:tcPr>
@@ -1482,95 +1405,9 @@
             <w:r>
               <w:rPr>
                 <w:rFonts w:ascii="Calibri" w:hAnsi="Calibri" w:eastAsia="Microsoft YaHei"/>
-                <w:b/>
+                <w:sz w:val="19"/>
               </w:rPr>
-              <w:t>接令时核对</w:t>
-            </w:r>
-          </w:p>
-        </w:tc>
-        <w:tc>
-          <w:tcPr>
-            <w:tcW w:type="dxa" w:w="3096"/>
-            <w:shd w:fill="EAF2F8"/>
-            <w:tcMar>
-              <w:top w:w="90" w:type="dxa"/>
-              <w:start w:w="120" w:type="dxa"/>
-              <w:bottom w:w="90" w:type="dxa"/>
-              <w:end w:w="120" w:type="dxa"/>
-            </w:tcMar>
-          </w:tcPr>
-          <w:p>
-            <w:r>
-              <w:rPr>
-                <w:rFonts w:ascii="Calibri" w:hAnsi="Calibri" w:eastAsia="Microsoft YaHei"/>
-                <w:b/>
-              </w:rPr>
-              <w:t>接令后的责任</w:t>
-            </w:r>
-          </w:p>
-        </w:tc>
-        <w:tc>
-          <w:tcPr>
-            <w:tcW w:type="dxa" w:w="1656"/>
-            <w:shd w:fill="EAF2F8"/>
-            <w:tcMar>
-              <w:top w:w="90" w:type="dxa"/>
-              <w:start w:w="120" w:type="dxa"/>
-              <w:bottom w:w="90" w:type="dxa"/>
-              <w:end w:w="120" w:type="dxa"/>
-            </w:tcMar>
-          </w:tcPr>
-          <w:p>
-            <w:r>
-              <w:rPr>
-                <w:rFonts w:ascii="Calibri" w:hAnsi="Calibri" w:eastAsia="Microsoft YaHei"/>
-                <w:b/>
-              </w:rPr>
-              <w:t>退回处理</w:t>
-            </w:r>
-          </w:p>
-        </w:tc>
-      </w:tr>
-      <w:tr>
-        <w:tc>
-          <w:tcPr>
-            <w:tcW w:type="dxa" w:w="1440"/>
-            <w:vAlign w:val="center"/>
-            <w:tcMar>
-              <w:top w:w="90" w:type="dxa"/>
-              <w:start w:w="120" w:type="dxa"/>
-              <w:bottom w:w="90" w:type="dxa"/>
-              <w:end w:w="120" w:type="dxa"/>
-            </w:tcMar>
-          </w:tcPr>
-          <w:p>
-            <w:r>
-              <w:rPr>
-                <w:rFonts w:ascii="Calibri" w:hAnsi="Calibri" w:eastAsia="Microsoft YaHei"/>
-                <w:sz w:val="18"/>
-              </w:rPr>
-              <w:t>合成主操</w:t>
-            </w:r>
-          </w:p>
-        </w:tc>
-        <w:tc>
-          <w:tcPr>
-            <w:tcW w:type="dxa" w:w="3024"/>
-            <w:vAlign w:val="center"/>
-            <w:tcMar>
-              <w:top w:w="90" w:type="dxa"/>
-              <w:start w:w="120" w:type="dxa"/>
-              <w:bottom w:w="90" w:type="dxa"/>
-              <w:end w:w="120" w:type="dxa"/>
-            </w:tcMar>
-          </w:tcPr>
-          <w:p>
-            <w:r>
-              <w:rPr>
-                <w:rFonts w:ascii="Calibri" w:hAnsi="Calibri" w:eastAsia="Microsoft YaHei"/>
-                <w:sz w:val="18"/>
-              </w:rPr>
-              <w:t>目标负荷、升降负荷节奏、保持条件和撤销条件</w:t>
+              <w:t>区分公开参考和企业执行价格</w:t>
             </w:r>
           </w:p>
         </w:tc>
@@ -1579,9 +1416,9 @@
             <w:tcW w:type="dxa" w:w="3096"/>
             <w:vAlign w:val="center"/>
             <w:tcMar>
-              <w:top w:w="90" w:type="dxa"/>
+              <w:top w:w="80" w:type="dxa"/>
               <w:start w:w="120" w:type="dxa"/>
-              <w:bottom w:w="90" w:type="dxa"/>
+              <w:bottom w:w="80" w:type="dxa"/>
               <w:end w:w="120" w:type="dxa"/>
             </w:tcMar>
           </w:tcPr>
@@ -1589,20 +1426,20 @@
             <w:r>
               <w:rPr>
                 <w:rFonts w:ascii="Calibri" w:hAnsi="Calibri" w:eastAsia="Microsoft YaHei"/>
-                <w:sz w:val="18"/>
+                <w:sz w:val="19"/>
               </w:rPr>
-              <w:t>确认收到有效版本，按现行操作票组织执行</w:t>
+              <w:t>先读取官方参考，再由经营人员确认样例行情</w:t>
             </w:r>
           </w:p>
         </w:tc>
         <w:tc>
           <w:tcPr>
-            <w:tcW w:type="dxa" w:w="1656"/>
+            <w:tcW w:type="dxa" w:w="2376"/>
             <w:vAlign w:val="center"/>
             <w:tcMar>
-              <w:top w:w="90" w:type="dxa"/>
+              <w:top w:w="80" w:type="dxa"/>
               <w:start w:w="120" w:type="dxa"/>
-              <w:bottom w:w="90" w:type="dxa"/>
+              <w:bottom w:w="80" w:type="dxa"/>
               <w:end w:w="120" w:type="dxa"/>
             </w:tcMar>
           </w:tcPr>
@@ -1610,9 +1447,9 @@
             <w:r>
               <w:rPr>
                 <w:rFonts w:ascii="Calibri" w:hAnsi="Calibri" w:eastAsia="Microsoft YaHei"/>
-                <w:sz w:val="18"/>
+                <w:sz w:val="19"/>
               </w:rPr>
-              <w:t>保留原计划并反馈不可执行原因</w:t>
+              <w:t>未确认时冻结新的经济排序</w:t>
             </w:r>
           </w:p>
         </w:tc>
@@ -1620,12 +1457,12 @@
       <w:tr>
         <w:tc>
           <w:tcPr>
-            <w:tcW w:type="dxa" w:w="1440"/>
+            <w:tcW w:type="dxa" w:w="1800"/>
             <w:vAlign w:val="center"/>
             <w:tcMar>
-              <w:top w:w="90" w:type="dxa"/>
+              <w:top w:w="80" w:type="dxa"/>
               <w:start w:w="120" w:type="dxa"/>
-              <w:bottom w:w="90" w:type="dxa"/>
+              <w:bottom w:w="80" w:type="dxa"/>
               <w:end w:w="120" w:type="dxa"/>
             </w:tcMar>
           </w:tcPr>
@@ -1633,20 +1470,20 @@
             <w:r>
               <w:rPr>
                 <w:rFonts w:ascii="Calibri" w:hAnsi="Calibri" w:eastAsia="Microsoft YaHei"/>
-                <w:sz w:val="18"/>
+                <w:sz w:val="19"/>
               </w:rPr>
-              <w:t>硝酸主操</w:t>
+              <w:t>24小时液氨平衡</w:t>
             </w:r>
           </w:p>
         </w:tc>
         <w:tc>
           <w:tcPr>
-            <w:tcW w:type="dxa" w:w="3024"/>
+            <w:tcW w:type="dxa" w:w="2592"/>
             <w:vAlign w:val="center"/>
             <w:tcMar>
-              <w:top w:w="90" w:type="dxa"/>
+              <w:top w:w="80" w:type="dxa"/>
               <w:start w:w="120" w:type="dxa"/>
-              <w:bottom w:w="90" w:type="dxa"/>
+              <w:bottom w:w="80" w:type="dxa"/>
               <w:end w:w="120" w:type="dxa"/>
             </w:tcMar>
           </w:tcPr>
@@ -1654,9 +1491,9 @@
             <w:r>
               <w:rPr>
                 <w:rFonts w:ascii="Calibri" w:hAnsi="Calibri" w:eastAsia="Microsoft YaHei"/>
-                <w:sz w:val="18"/>
+                <w:sz w:val="19"/>
               </w:rPr>
-              <w:t>下游目标负荷、耗氨窗口、缓冲能力和恢复条件</w:t>
+              <w:t>核对液氨从哪里来、分给谁、期末剩多少</w:t>
             </w:r>
           </w:p>
         </w:tc>
@@ -1665,9 +1502,9 @@
             <w:tcW w:type="dxa" w:w="3096"/>
             <w:vAlign w:val="center"/>
             <w:tcMar>
-              <w:top w:w="90" w:type="dxa"/>
+              <w:top w:w="80" w:type="dxa"/>
               <w:start w:w="120" w:type="dxa"/>
-              <w:bottom w:w="90" w:type="dxa"/>
+              <w:bottom w:w="80" w:type="dxa"/>
               <w:end w:w="120" w:type="dxa"/>
             </w:tcMar>
           </w:tcPr>
@@ -1675,20 +1512,20 @@
             <w:r>
               <w:rPr>
                 <w:rFonts w:ascii="Calibri" w:hAnsi="Calibri" w:eastAsia="Microsoft YaHei"/>
-                <w:sz w:val="18"/>
+                <w:sz w:val="19"/>
               </w:rPr>
-              <w:t>确认下游承接节奏与现场条件</w:t>
+              <w:t>先看期末可用量和安全余量</w:t>
             </w:r>
           </w:p>
         </w:tc>
         <w:tc>
           <w:tcPr>
-            <w:tcW w:type="dxa" w:w="1656"/>
+            <w:tcW w:type="dxa" w:w="2376"/>
             <w:vAlign w:val="center"/>
             <w:tcMar>
-              <w:top w:w="90" w:type="dxa"/>
+              <w:top w:w="80" w:type="dxa"/>
               <w:start w:w="120" w:type="dxa"/>
-              <w:bottom w:w="90" w:type="dxa"/>
+              <w:bottom w:w="80" w:type="dxa"/>
               <w:end w:w="120" w:type="dxa"/>
             </w:tcMar>
           </w:tcPr>
@@ -1696,9 +1533,9 @@
             <w:r>
               <w:rPr>
                 <w:rFonts w:ascii="Calibri" w:hAnsi="Calibri" w:eastAsia="Microsoft YaHei"/>
-                <w:sz w:val="18"/>
+                <w:sz w:val="19"/>
               </w:rPr>
-              <w:t>退回调度重算液氨去向与负荷方案</w:t>
+              <w:t>预计值不能替代罐区实测</w:t>
             </w:r>
           </w:p>
         </w:tc>
@@ -1706,12 +1543,12 @@
       <w:tr>
         <w:tc>
           <w:tcPr>
-            <w:tcW w:type="dxa" w:w="1440"/>
+            <w:tcW w:type="dxa" w:w="1800"/>
             <w:vAlign w:val="center"/>
             <w:tcMar>
-              <w:top w:w="90" w:type="dxa"/>
+              <w:top w:w="80" w:type="dxa"/>
               <w:start w:w="120" w:type="dxa"/>
-              <w:bottom w:w="90" w:type="dxa"/>
+              <w:bottom w:w="80" w:type="dxa"/>
               <w:end w:w="120" w:type="dxa"/>
             </w:tcMar>
           </w:tcPr>
@@ -1719,20 +1556,20 @@
             <w:r>
               <w:rPr>
                 <w:rFonts w:ascii="Calibri" w:hAnsi="Calibri" w:eastAsia="Microsoft YaHei"/>
-                <w:sz w:val="18"/>
+                <w:sz w:val="19"/>
               </w:rPr>
-              <w:t>罐区/调度</w:t>
+              <w:t>趋势证据</w:t>
             </w:r>
           </w:p>
         </w:tc>
         <w:tc>
           <w:tcPr>
-            <w:tcW w:type="dxa" w:w="3024"/>
+            <w:tcW w:type="dxa" w:w="2592"/>
             <w:vAlign w:val="center"/>
             <w:tcMar>
-              <w:top w:w="90" w:type="dxa"/>
+              <w:top w:w="80" w:type="dxa"/>
               <w:start w:w="120" w:type="dxa"/>
-              <w:bottom w:w="90" w:type="dxa"/>
+              <w:bottom w:w="80" w:type="dxa"/>
               <w:end w:w="120" w:type="dxa"/>
             </w:tcMar>
           </w:tcPr>
@@ -1740,9 +1577,9 @@
             <w:r>
               <w:rPr>
                 <w:rFonts w:ascii="Calibri" w:hAnsi="Calibri" w:eastAsia="Microsoft YaHei"/>
-                <w:sz w:val="18"/>
+                <w:sz w:val="19"/>
               </w:rPr>
-              <w:t>液氨库存、收发安排、安全库存和物流窗口</w:t>
+              <w:t>提前提示压机等设备需要复核</w:t>
             </w:r>
           </w:p>
         </w:tc>
@@ -1751,9 +1588,9 @@
             <w:tcW w:type="dxa" w:w="3096"/>
             <w:vAlign w:val="center"/>
             <w:tcMar>
-              <w:top w:w="90" w:type="dxa"/>
+              <w:top w:w="80" w:type="dxa"/>
               <w:start w:w="120" w:type="dxa"/>
-              <w:bottom w:w="90" w:type="dxa"/>
+              <w:bottom w:w="80" w:type="dxa"/>
               <w:end w:w="120" w:type="dxa"/>
             </w:tcMar>
           </w:tcPr>
@@ -1761,20 +1598,20 @@
             <w:r>
               <w:rPr>
                 <w:rFonts w:ascii="Calibri" w:hAnsi="Calibri" w:eastAsia="Microsoft YaHei"/>
-                <w:sz w:val="18"/>
+                <w:sz w:val="19"/>
               </w:rPr>
-              <w:t>确认库存与收发计划能够支撑动作单</w:t>
+              <w:t>看多变量是否持续同向变化</w:t>
             </w:r>
           </w:p>
         </w:tc>
         <w:tc>
           <w:tcPr>
-            <w:tcW w:type="dxa" w:w="1656"/>
+            <w:tcW w:type="dxa" w:w="2376"/>
             <w:vAlign w:val="center"/>
             <w:tcMar>
-              <w:top w:w="90" w:type="dxa"/>
+              <w:top w:w="80" w:type="dxa"/>
               <w:start w:w="120" w:type="dxa"/>
-              <w:bottom w:w="90" w:type="dxa"/>
+              <w:bottom w:w="80" w:type="dxa"/>
               <w:end w:w="120" w:type="dxa"/>
             </w:tcMar>
           </w:tcPr>
@@ -1782,9 +1619,9 @@
             <w:r>
               <w:rPr>
                 <w:rFonts w:ascii="Calibri" w:hAnsi="Calibri" w:eastAsia="Microsoft YaHei"/>
-                <w:sz w:val="18"/>
+                <w:sz w:val="19"/>
               </w:rPr>
-              <w:t>标记冲突并冻结执行跟踪入口</w:t>
+              <w:t>不等于DCS报警或SIS联锁</w:t>
             </w:r>
           </w:p>
         </w:tc>
@@ -1792,12 +1629,12 @@
       <w:tr>
         <w:tc>
           <w:tcPr>
-            <w:tcW w:type="dxa" w:w="1440"/>
+            <w:tcW w:type="dxa" w:w="1800"/>
             <w:vAlign w:val="center"/>
             <w:tcMar>
-              <w:top w:w="90" w:type="dxa"/>
+              <w:top w:w="80" w:type="dxa"/>
               <w:start w:w="120" w:type="dxa"/>
-              <w:bottom w:w="90" w:type="dxa"/>
+              <w:bottom w:w="80" w:type="dxa"/>
               <w:end w:w="120" w:type="dxa"/>
             </w:tcMar>
           </w:tcPr>
@@ -1805,20 +1642,20 @@
             <w:r>
               <w:rPr>
                 <w:rFonts w:ascii="Calibri" w:hAnsi="Calibri" w:eastAsia="Microsoft YaHei"/>
-                <w:sz w:val="18"/>
+                <w:sz w:val="19"/>
               </w:rPr>
-              <w:t>公辅调度</w:t>
+              <w:t>动作单</w:t>
             </w:r>
           </w:p>
         </w:tc>
         <w:tc>
           <w:tcPr>
-            <w:tcW w:type="dxa" w:w="3024"/>
+            <w:tcW w:type="dxa" w:w="2592"/>
             <w:vAlign w:val="center"/>
             <w:tcMar>
-              <w:top w:w="90" w:type="dxa"/>
+              <w:top w:w="80" w:type="dxa"/>
               <w:start w:w="120" w:type="dxa"/>
-              <w:bottom w:w="90" w:type="dxa"/>
+              <w:bottom w:w="80" w:type="dxa"/>
               <w:end w:w="120" w:type="dxa"/>
             </w:tcMar>
           </w:tcPr>
@@ -1826,9 +1663,9 @@
             <w:r>
               <w:rPr>
                 <w:rFonts w:ascii="Calibri" w:hAnsi="Calibri" w:eastAsia="Microsoft YaHei"/>
-                <w:sz w:val="18"/>
+                <w:sz w:val="19"/>
               </w:rPr>
-              <w:t>蒸汽、电力、空分、循环水等余量和时间窗口</w:t>
+              <w:t>把跨装置决定拆给责任岗位</w:t>
             </w:r>
           </w:p>
         </w:tc>
@@ -1837,9 +1674,9 @@
             <w:tcW w:type="dxa" w:w="3096"/>
             <w:vAlign w:val="center"/>
             <w:tcMar>
-              <w:top w:w="90" w:type="dxa"/>
+              <w:top w:w="80" w:type="dxa"/>
               <w:start w:w="120" w:type="dxa"/>
-              <w:bottom w:w="90" w:type="dxa"/>
+              <w:bottom w:w="80" w:type="dxa"/>
               <w:end w:w="120" w:type="dxa"/>
             </w:tcMar>
           </w:tcPr>
@@ -1847,20 +1684,20 @@
             <w:r>
               <w:rPr>
                 <w:rFonts w:ascii="Calibri" w:hAnsi="Calibri" w:eastAsia="Microsoft YaHei"/>
-                <w:sz w:val="18"/>
+                <w:sz w:val="19"/>
               </w:rPr>
-              <w:t>确认公辅条件满足动作单要求</w:t>
+              <w:t>岗位复核前置条件后记录接令</w:t>
             </w:r>
           </w:p>
         </w:tc>
         <w:tc>
           <w:tcPr>
-            <w:tcW w:type="dxa" w:w="1656"/>
+            <w:tcW w:type="dxa" w:w="2376"/>
             <w:vAlign w:val="center"/>
             <w:tcMar>
-              <w:top w:w="90" w:type="dxa"/>
+              <w:top w:w="80" w:type="dxa"/>
               <w:start w:w="120" w:type="dxa"/>
-              <w:bottom w:w="90" w:type="dxa"/>
+              <w:bottom w:w="80" w:type="dxa"/>
               <w:end w:w="120" w:type="dxa"/>
             </w:tcMar>
           </w:tcPr>
@@ -1868,110 +1705,284 @@
             <w:r>
               <w:rPr>
                 <w:rFonts w:ascii="Calibri" w:hAnsi="Calibri" w:eastAsia="Microsoft YaHei"/>
-                <w:sz w:val="18"/>
+                <w:sz w:val="19"/>
               </w:rPr>
-              <w:t>返回受限时段和可用窗口，重新排程</w:t>
+              <w:t>接令不等于已执行</w:t>
+            </w:r>
+          </w:p>
+        </w:tc>
+      </w:tr>
+      <w:tr>
+        <w:tc>
+          <w:tcPr>
+            <w:tcW w:type="dxa" w:w="1800"/>
+            <w:vAlign w:val="center"/>
+            <w:tcMar>
+              <w:top w:w="80" w:type="dxa"/>
+              <w:start w:w="120" w:type="dxa"/>
+              <w:bottom w:w="80" w:type="dxa"/>
+              <w:end w:w="120" w:type="dxa"/>
+            </w:tcMar>
+          </w:tcPr>
+          <w:p>
+            <w:r>
+              <w:rPr>
+                <w:rFonts w:ascii="Calibri" w:hAnsi="Calibri" w:eastAsia="Microsoft YaHei"/>
+                <w:sz w:val="19"/>
+              </w:rPr>
+              <w:t>飞书协同</w:t>
+            </w:r>
+          </w:p>
+        </w:tc>
+        <w:tc>
+          <w:tcPr>
+            <w:tcW w:type="dxa" w:w="2592"/>
+            <w:vAlign w:val="center"/>
+            <w:tcMar>
+              <w:top w:w="80" w:type="dxa"/>
+              <w:start w:w="120" w:type="dxa"/>
+              <w:bottom w:w="80" w:type="dxa"/>
+              <w:end w:w="120" w:type="dxa"/>
+            </w:tcMar>
+          </w:tcPr>
+          <w:p>
+            <w:r>
+              <w:rPr>
+                <w:rFonts w:ascii="Calibri" w:hAnsi="Calibri" w:eastAsia="Microsoft YaHei"/>
+                <w:sz w:val="19"/>
+              </w:rPr>
+              <w:t>承接卡片、审批、任务和复盘</w:t>
+            </w:r>
+          </w:p>
+        </w:tc>
+        <w:tc>
+          <w:tcPr>
+            <w:tcW w:type="dxa" w:w="3096"/>
+            <w:vAlign w:val="center"/>
+            <w:tcMar>
+              <w:top w:w="80" w:type="dxa"/>
+              <w:start w:w="120" w:type="dxa"/>
+              <w:bottom w:w="80" w:type="dxa"/>
+              <w:end w:w="120" w:type="dxa"/>
+            </w:tcMar>
+          </w:tcPr>
+          <w:p>
+            <w:r>
+              <w:rPr>
+                <w:rFonts w:ascii="Calibri" w:hAnsi="Calibri" w:eastAsia="Microsoft YaHei"/>
+                <w:sz w:val="19"/>
+              </w:rPr>
+              <w:t>先生成演示草稿，再接企业应用权限</w:t>
+            </w:r>
+          </w:p>
+        </w:tc>
+        <w:tc>
+          <w:tcPr>
+            <w:tcW w:type="dxa" w:w="2376"/>
+            <w:vAlign w:val="center"/>
+            <w:tcMar>
+              <w:top w:w="80" w:type="dxa"/>
+              <w:start w:w="120" w:type="dxa"/>
+              <w:bottom w:w="80" w:type="dxa"/>
+              <w:end w:w="120" w:type="dxa"/>
+            </w:tcMar>
+          </w:tcPr>
+          <w:p>
+            <w:r>
+              <w:rPr>
+                <w:rFonts w:ascii="Calibri" w:hAnsi="Calibri" w:eastAsia="Microsoft YaHei"/>
+                <w:sz w:val="19"/>
+              </w:rPr>
+              <w:t>当前原型不代表真实写回</w:t>
+            </w:r>
+          </w:p>
+        </w:tc>
+      </w:tr>
+      <w:tr>
+        <w:tc>
+          <w:tcPr>
+            <w:tcW w:type="dxa" w:w="1800"/>
+            <w:vAlign w:val="center"/>
+            <w:tcMar>
+              <w:top w:w="80" w:type="dxa"/>
+              <w:start w:w="120" w:type="dxa"/>
+              <w:bottom w:w="80" w:type="dxa"/>
+              <w:end w:w="120" w:type="dxa"/>
+            </w:tcMar>
+          </w:tcPr>
+          <w:p>
+            <w:r>
+              <w:rPr>
+                <w:rFonts w:ascii="Calibri" w:hAnsi="Calibri" w:eastAsia="Microsoft YaHei"/>
+                <w:sz w:val="19"/>
+              </w:rPr>
+              <w:t>证据包</w:t>
+            </w:r>
+          </w:p>
+        </w:tc>
+        <w:tc>
+          <w:tcPr>
+            <w:tcW w:type="dxa" w:w="2592"/>
+            <w:vAlign w:val="center"/>
+            <w:tcMar>
+              <w:top w:w="80" w:type="dxa"/>
+              <w:start w:w="120" w:type="dxa"/>
+              <w:bottom w:w="80" w:type="dxa"/>
+              <w:end w:w="120" w:type="dxa"/>
+            </w:tcMar>
+          </w:tcPr>
+          <w:p>
+            <w:r>
+              <w:rPr>
+                <w:rFonts w:ascii="Calibri" w:hAnsi="Calibri" w:eastAsia="Microsoft YaHei"/>
+                <w:sz w:val="19"/>
+              </w:rPr>
+              <w:t>保存输入、门禁、动作和审计记录</w:t>
+            </w:r>
+          </w:p>
+        </w:tc>
+        <w:tc>
+          <w:tcPr>
+            <w:tcW w:type="dxa" w:w="3096"/>
+            <w:vAlign w:val="center"/>
+            <w:tcMar>
+              <w:top w:w="80" w:type="dxa"/>
+              <w:start w:w="120" w:type="dxa"/>
+              <w:bottom w:w="80" w:type="dxa"/>
+              <w:end w:w="120" w:type="dxa"/>
+            </w:tcMar>
+          </w:tcPr>
+          <w:p>
+            <w:r>
+              <w:rPr>
+                <w:rFonts w:ascii="Calibri" w:hAnsi="Calibri" w:eastAsia="Microsoft YaHei"/>
+                <w:sz w:val="19"/>
+              </w:rPr>
+              <w:t>点击导出JSON</w:t>
+            </w:r>
+          </w:p>
+        </w:tc>
+        <w:tc>
+          <w:tcPr>
+            <w:tcW w:type="dxa" w:w="2376"/>
+            <w:vAlign w:val="center"/>
+            <w:tcMar>
+              <w:top w:w="80" w:type="dxa"/>
+              <w:start w:w="120" w:type="dxa"/>
+              <w:bottom w:w="80" w:type="dxa"/>
+              <w:end w:w="120" w:type="dxa"/>
+            </w:tcMar>
+          </w:tcPr>
+          <w:p>
+            <w:r>
+              <w:rPr>
+                <w:rFonts w:ascii="Calibri" w:hAnsi="Calibri" w:eastAsia="Microsoft YaHei"/>
+                <w:sz w:val="19"/>
+              </w:rPr>
+              <w:t>用于交接和验收，不自动写入生产系统</w:t>
             </w:r>
           </w:p>
         </w:tc>
       </w:tr>
     </w:tbl>
     <w:p>
+      <w:pPr>
+        <w:pStyle w:val="Heading1"/>
+      </w:pPr>
       <w:r>
-        <w:rPr>
-          <w:rFonts w:ascii="Calibri" w:hAnsi="Calibri" w:eastAsia="Microsoft YaHei"/>
-        </w:rPr>
-        <w:t>动作单以班次编号、方案版本和岗位标识唯一记录接令人、接令时间、回复、异常和有效期。审批状态机与动作单门禁为原型，Task v2普通任务写入已验证；自动拆单、岗位身份映射和事件汇总待授权。实际负荷、库存和能耗只接受Historian或企业认可的只读事实源回传，无回传时保持为空。</w:t>
+        <w:t>7. 非专业人员需要先理解的术语</w:t>
       </w:r>
     </w:p>
     <w:p>
       <w:pPr>
-        <w:pStyle w:val="Heading1"/>
-      </w:pPr>
-      <w:r>
-        <w:t>5. 班次留痕顺序</w:t>
-      </w:r>
-    </w:p>
-    <w:p>
-      <w:pPr>
-        <w:pStyle w:val="ListNumber"/>
-        <w:numPr>
-          <w:ilvl w:val="0"/>
-          <w:numId w:val="12"/>
-        </w:numPr>
+        <w:pStyle w:val="ListBullet"/>
       </w:pPr>
       <w:r>
         <w:rPr>
           <w:rFonts w:ascii="Calibri" w:hAnsi="Calibri" w:eastAsia="Microsoft YaHei"/>
         </w:rPr>
-        <w:t>建议生成前冻结原计划和输入快照，记录数据来源、时间、单位和质量状态。</w:t>
+        <w:t>液氨：合成氨装置的主要产品，也是尿素、复合肥、硝酸、联碱等下游装置的共同原料。</w:t>
       </w:r>
     </w:p>
     <w:p>
       <w:pPr>
-        <w:pStyle w:val="ListNumber"/>
-        <w:numPr>
-          <w:ilvl w:val="0"/>
-          <w:numId w:val="12"/>
-        </w:numPr>
+        <w:pStyle w:val="ListBullet"/>
       </w:pPr>
       <w:r>
         <w:rPr>
           <w:rFonts w:ascii="Calibri" w:hAnsi="Calibri" w:eastAsia="Microsoft YaHei"/>
         </w:rPr>
-        <w:t>审批完成后生成四岗位动作单，任何岗位未接令或退回时保留原计划并返回调度重算。</w:t>
+        <w:t>负荷：装置开到多大程度；网页中的目标负荷是建议值，不是已经执行的实际值。</w:t>
       </w:r>
     </w:p>
     <w:p>
       <w:pPr>
-        <w:pStyle w:val="ListNumber"/>
-        <w:numPr>
-          <w:ilvl w:val="0"/>
-          <w:numId w:val="12"/>
-        </w:numPr>
+        <w:pStyle w:val="ListBullet"/>
       </w:pPr>
       <w:r>
         <w:rPr>
           <w:rFonts w:ascii="Calibri" w:hAnsi="Calibri" w:eastAsia="Microsoft YaHei"/>
         </w:rPr>
-        <w:t>全部接令后进入执行跟踪，但不得把接令状态、任务完成按钮或人工备注填作实际负荷。</w:t>
+        <w:t>DCS：负责装置局部调节、顺控和报警；本平台不写入DCS。</w:t>
       </w:r>
     </w:p>
     <w:p>
       <w:pPr>
-        <w:pStyle w:val="ListNumber"/>
-        <w:numPr>
-          <w:ilvl w:val="0"/>
-          <w:numId w:val="12"/>
-        </w:numPr>
+        <w:pStyle w:val="ListBullet"/>
       </w:pPr>
       <w:r>
         <w:rPr>
           <w:rFonts w:ascii="Calibri" w:hAnsi="Calibri" w:eastAsia="Microsoft YaHei"/>
         </w:rPr>
-        <w:t>Historian回传后计算建议值与实际值偏差；无回传时实际值为空，不进入效果统计。</w:t>
+        <w:t>SIS：负责安全联锁和保护；本平台不绕过SIS。</w:t>
       </w:r>
     </w:p>
     <w:p>
       <w:pPr>
-        <w:pStyle w:val="ListNumber"/>
-        <w:numPr>
-          <w:ilvl w:val="0"/>
-          <w:numId w:val="12"/>
-        </w:numPr>
+        <w:pStyle w:val="ListBullet"/>
       </w:pPr>
       <w:r>
         <w:rPr>
           <w:rFonts w:ascii="Calibri" w:hAnsi="Calibri" w:eastAsia="Microsoft YaHei"/>
         </w:rPr>
-        <w:t>班后记录事实、决定、执行、原因和适用条件，经专业人员审核后归档。</w:t>
+        <w:t>MES/ERP：MES记录生产计划和执行事实，ERP提供订单、价格和结算口径。</w:t>
+      </w:r>
+    </w:p>
+    <w:p>
+      <w:pPr>
+        <w:pStyle w:val="ListBullet"/>
+      </w:pPr>
+      <w:r>
+        <w:rPr>
+          <w:rFonts w:ascii="Calibri" w:hAnsi="Calibri" w:eastAsia="Microsoft YaHei"/>
+        </w:rPr>
+        <w:t>Historian：保存真实生产点位和历史趋势；没有接入时不填写实际负荷、能耗和收益。</w:t>
+      </w:r>
+    </w:p>
+    <w:p>
+      <w:pPr>
+        <w:pStyle w:val="ListBullet"/>
+      </w:pPr>
+      <w:r>
+        <w:rPr>
+          <w:rFonts w:ascii="Calibri" w:hAnsi="Calibri" w:eastAsia="Microsoft YaHei"/>
+        </w:rPr>
+        <w:t>影子运行：平台先给建议，现场仍按原流程生产，用实际结果验证建议，再决定是否小范围执行。</w:t>
+      </w:r>
+    </w:p>
+    <w:p>
+      <w:r>
+        <w:rPr>
+          <w:rFonts w:ascii="Calibri" w:hAnsi="Calibri" w:eastAsia="Microsoft YaHei"/>
+        </w:rPr>
+        <w:t>完整的逐组件说明、上手路径和常见状态处理见项目文件 docs/user-guide-for-beginners.md。</w:t>
       </w:r>
     </w:p>
     <w:sectPr>
       <w:headerReference w:type="default" r:id="rId9"/>
       <w:footerReference w:type="default" r:id="rId10"/>
       <w:pgSz w:w="12240" w:h="15840"/>
-      <w:pgMar w:top="1123" w:right="1238" w:bottom="1123" w:left="1238" w:header="547" w:footer="547" w:gutter="0"/>
+      <w:pgMar w:top="1224" w:right="1296" w:bottom="1224" w:left="1296" w:header="648" w:footer="648" w:gutter="0"/>
       <w:cols w:space="720"/>
       <w:docGrid w:linePitch="360"/>
     </w:sectPr>
@@ -2000,10 +2011,10 @@
     <w:r>
       <w:rPr>
         <w:rFonts w:ascii="Calibri" w:hAnsi="Calibri" w:eastAsia="Microsoft YaHei"/>
-        <w:color w:val="5A6976"/>
-        <w:sz w:val="17"/>
-      </w:rPr>
-      <w:t>氨智领航调控师 | 合成氨生产调度专家平台</w:t>
+        <w:color w:val="5A5A5A"/>
+        <w:sz w:val="18"/>
+      </w:rPr>
+      <w:t>合成氨生产调度专家平台 | 提交材料</w:t>
     </w:r>
   </w:p>
 </w:hdr>
@@ -2208,24 +2219,6 @@
   </w:num>
   <w:num w:numId="9">
     <w:abstractNumId w:val="0"/>
-  </w:num>
-  <w:num w:numId="10">
-    <w:abstractNumId w:val="7"/>
-    <w:lvlOverride w:ilvl="0">
-      <w:startOverride w:val="1"/>
-    </w:lvlOverride>
-  </w:num>
-  <w:num w:numId="11">
-    <w:abstractNumId w:val="7"/>
-    <w:lvlOverride w:ilvl="0">
-      <w:startOverride w:val="1"/>
-    </w:lvlOverride>
-  </w:num>
-  <w:num w:numId="12">
-    <w:abstractNumId w:val="7"/>
-    <w:lvlOverride w:ilvl="0">
-      <w:startOverride w:val="1"/>
-    </w:lvlOverride>
   </w:num>
 </w:numbering>
 </file>
@@ -2391,7 +2384,7 @@
     <w:qFormat/>
     <w:rsid w:val="00FC693F"/>
     <w:pPr>
-      <w:spacing w:line="283" w:lineRule="auto" w:after="100"/>
+      <w:spacing w:line="276" w:lineRule="auto" w:after="120"/>
     </w:pPr>
     <w:rPr>
       <w:rFonts w:ascii="Calibri" w:hAnsi="Calibri" w:eastAsia="Microsoft YaHei"/>
@@ -2460,8 +2453,8 @@
       <w:rFonts w:asciiTheme="majorHAnsi" w:eastAsiaTheme="majorEastAsia" w:hAnsiTheme="majorHAnsi" w:cstheme="majorBidi" w:ascii="Calibri" w:hAnsi="Calibri" w:eastAsia="Microsoft YaHei"/>
       <w:b/>
       <w:bCs/>
-      <w:color w:val="184E77"/>
-      <w:sz w:val="30"/>
+      <w:color w:val="1F4E79"/>
+      <w:sz w:val="32"/>
       <w:szCs w:val="28"/>
     </w:rPr>
   </w:style>
@@ -2484,8 +2477,8 @@
       <w:rFonts w:asciiTheme="majorHAnsi" w:eastAsiaTheme="majorEastAsia" w:hAnsiTheme="majorHAnsi" w:cstheme="majorBidi" w:ascii="Calibri" w:hAnsi="Calibri" w:eastAsia="Microsoft YaHei"/>
       <w:b/>
       <w:bCs/>
-      <w:color w:val="184E77"/>
-      <w:sz w:val="25"/>
+      <w:color w:val="1F4E79"/>
+      <w:sz w:val="26"/>
       <w:szCs w:val="26"/>
     </w:rPr>
   </w:style>
@@ -2508,8 +2501,8 @@
       <w:rFonts w:asciiTheme="majorHAnsi" w:eastAsiaTheme="majorEastAsia" w:hAnsiTheme="majorHAnsi" w:cstheme="majorBidi" w:ascii="Calibri" w:hAnsi="Calibri" w:eastAsia="Microsoft YaHei"/>
       <w:b/>
       <w:bCs/>
-      <w:color w:val="184E77"/>
-      <w:sz w:val="23"/>
+      <w:color w:val="1F4D78"/>
+      <w:sz w:val="24"/>
     </w:rPr>
   </w:style>
   <w:style w:type="paragraph" w:styleId="Heading4">

</xml_diff>